<commit_message>
Failed experiment on Constant
</commit_message>
<xml_diff>
--- a/claude-blog/fairness-has-memory/_test-build-6k.docx
+++ b/claude-blog/fairness-has-memory/_test-build-6k.docx
@@ -1063,13 +1063,553 @@
         <w:t xml:space="preserve"> </w:t>
       </w:r>
       <w:r>
+        <w:t xml:space="preserve">as</w:t>
+      </w:r>
+      <w:r>
+        <w:t xml:space="preserve"> </w:t>
+      </w:r>
+      <w:r>
+        <w:t xml:space="preserve">far</w:t>
+      </w:r>
+      <w:r>
+        <w:t xml:space="preserve"> </w:t>
+      </w:r>
+      <w:r>
+        <w:t xml:space="preserve">as</w:t>
+      </w:r>
+      <w:r>
+        <w:t xml:space="preserve"> </w:t>
+      </w:r>
+      <w:r>
+        <w:t xml:space="preserve">the</w:t>
+      </w:r>
+      <w:r>
+        <w:t xml:space="preserve"> </w:t>
+      </w:r>
+      <w:r>
+        <w:t xml:space="preserve">chance</w:t>
+      </w:r>
+      <w:r>
+        <w:t xml:space="preserve"> </w:t>
+      </w:r>
+      <w:r>
+        <w:t xml:space="preserve">owed</w:t>
+      </w:r>
+      <w:r>
+        <w:t xml:space="preserve"> </w:t>
+      </w:r>
+      <w:r>
+        <w:t xml:space="preserve">to</w:t>
+      </w:r>
+      <w:r>
+        <w:t xml:space="preserve"> </w:t>
+      </w:r>
+      <w:r>
+        <w:t xml:space="preserve">those</w:t>
+      </w:r>
+      <w:r>
+        <w:t xml:space="preserve"> </w:t>
+      </w:r>
+      <w:r>
+        <w:t xml:space="preserve">who</w:t>
+      </w:r>
+      <w:r>
+        <w:t xml:space="preserve"> </w:t>
+      </w:r>
+      <w:r>
+        <w:t xml:space="preserve">may</w:t>
+      </w:r>
+      <w:r>
+        <w:t xml:space="preserve"> </w:t>
+      </w:r>
+      <w:r>
+        <w:t xml:space="preserve">leave</w:t>
+      </w:r>
+      <w:r>
+        <w:t xml:space="preserve"> </w:t>
+      </w:r>
+      <w:r>
+        <w:t xml:space="preserve">before</w:t>
+      </w:r>
+      <w:r>
+        <w:t xml:space="preserve"> </w:t>
+      </w:r>
+      <w:r>
+        <w:t xml:space="preserve">the</w:t>
+      </w:r>
+      <w:r>
+        <w:t xml:space="preserve"> </w:t>
+      </w:r>
+      <w:r>
+        <w:t xml:space="preserve">division</w:t>
+      </w:r>
+      <w:r>
+        <w:t xml:space="preserve"> </w:t>
+      </w:r>
+      <w:r>
+        <w:t xml:space="preserve">reaches</w:t>
+      </w:r>
+      <w:r>
+        <w:t xml:space="preserve"> </w:t>
+      </w:r>
+      <w:r>
+        <w:t xml:space="preserve">them</w:t>
+      </w:r>
+      <w:r>
+        <w:t xml:space="preserve"> </w:t>
+      </w:r>
+      <w:r>
+        <w:t xml:space="preserve">allows,</w:t>
+      </w:r>
+      <w:r>
+        <w:t xml:space="preserve"> </w:t>
+      </w:r>
+      <w:r>
+        <w:t xml:space="preserve">the</w:t>
+      </w:r>
+      <w:r>
+        <w:t xml:space="preserve"> </w:t>
+      </w:r>
+      <w:r>
+        <w:t xml:space="preserve">two</w:t>
+      </w:r>
+      <w:r>
+        <w:t xml:space="preserve"> </w:t>
+      </w:r>
+      <w:r>
+        <w:t xml:space="preserve">being</w:t>
+      </w:r>
+      <w:r>
+        <w:t xml:space="preserve"> </w:t>
+      </w:r>
+      <w:r>
+        <w:t xml:space="preserve">weighed</w:t>
+      </w:r>
+      <w:r>
+        <w:t xml:space="preserve"> </w:t>
+      </w:r>
+      <w:r>
+        <w:t xml:space="preserve">as</w:t>
+      </w:r>
+      <w:r>
+        <w:t xml:space="preserve"> </w:t>
+      </w:r>
+      <w:r>
+        <w:t xml:space="preserve">Broome</w:t>
+      </w:r>
+      <w:r>
+        <w:t xml:space="preserve"> </w:t>
+      </w:r>
+      <w:r>
+        <w:t xml:space="preserve">weighs</w:t>
+      </w:r>
+      <w:r>
+        <w:t xml:space="preserve"> </w:t>
+      </w:r>
+      <w:r>
+        <w:t xml:space="preserve">one</w:t>
+      </w:r>
+      <w:r>
+        <w:t xml:space="preserve"> </w:t>
+      </w:r>
+      <w:r>
+        <w:t xml:space="preserve">imperfect</w:t>
+      </w:r>
+      <w:r>
+        <w:t xml:space="preserve"> </w:t>
+      </w:r>
+      <w:r>
+        <w:t xml:space="preserve">fairness</w:t>
+      </w:r>
+      <w:r>
+        <w:t xml:space="preserve"> </w:t>
+      </w:r>
+      <w:r>
+        <w:t xml:space="preserve">against</w:t>
+      </w:r>
+      <w:r>
+        <w:t xml:space="preserve"> </w:t>
+      </w:r>
+      <w:r>
+        <w:t xml:space="preserve">another.</w:t>
+      </w:r>
+      <w:r>
+        <w:t xml:space="preserve"> </w:t>
+      </w:r>
+      <w:r>
+        <w:t xml:space="preserve">Where</w:t>
+      </w:r>
+      <w:r>
+        <w:t xml:space="preserve"> </w:t>
+      </w:r>
+      <w:r>
+        <w:t xml:space="preserve">the</w:t>
+      </w:r>
+      <w:r>
+        <w:t xml:space="preserve"> </w:t>
+      </w:r>
+      <w:r>
+        <w:t xml:space="preserve">good</w:t>
+      </w:r>
+      <w:r>
+        <w:t xml:space="preserve"> </w:t>
+      </w:r>
+      <w:r>
+        <w:t xml:space="preserve">recurs</w:t>
+      </w:r>
+      <w:r>
+        <w:t xml:space="preserve"> </w:t>
+      </w:r>
+      <w:r>
+        <w:t xml:space="preserve">that</w:t>
+      </w:r>
+      <w:r>
+        <w:t xml:space="preserve"> </w:t>
+      </w:r>
+      <w:r>
+        <w:t xml:space="preserve">is</w:t>
+      </w:r>
+      <w:r>
+        <w:t xml:space="preserve"> </w:t>
+      </w:r>
+      <w:r>
+        <w:t xml:space="preserve">far,</w:t>
+      </w:r>
+      <w:r>
+        <w:t xml:space="preserve"> </w:t>
+      </w:r>
+      <w:r>
+        <w:t xml:space="preserve">because</w:t>
+      </w:r>
+      <w:r>
+        <w:t xml:space="preserve"> </w:t>
+      </w:r>
+      <w:r>
+        <w:t xml:space="preserve">past</w:t>
+      </w:r>
+      <w:r>
+        <w:t xml:space="preserve"> </w:t>
+      </w:r>
+      <w:r>
+        <w:t xml:space="preserve">winners’</w:t>
+      </w:r>
+      <w:r>
+        <w:t xml:space="preserve"> </w:t>
+      </w:r>
+      <w:r>
+        <w:t xml:space="preserve">surplus</w:t>
+      </w:r>
+      <w:r>
+        <w:t xml:space="preserve"> </w:t>
+      </w:r>
+      <w:r>
+        <w:t xml:space="preserve">pays</w:t>
+      </w:r>
+      <w:r>
+        <w:t xml:space="preserve"> </w:t>
+      </w:r>
+      <w:r>
+        <w:t xml:space="preserve">for</w:t>
+      </w:r>
+      <w:r>
+        <w:t xml:space="preserve"> </w:t>
+      </w:r>
+      <w:r>
+        <w:t xml:space="preserve">memory;</w:t>
+      </w:r>
+      <w:r>
+        <w:t xml:space="preserve"> </w:t>
+      </w:r>
+      <w:r>
+        <w:t xml:space="preserve">where</w:t>
+      </w:r>
+      <w:r>
+        <w:t xml:space="preserve"> </w:t>
+      </w:r>
+      <w:r>
+        <w:t xml:space="preserve">winners</w:t>
+      </w:r>
+      <w:r>
+        <w:t xml:space="preserve"> </w:t>
+      </w:r>
+      <w:r>
+        <w:t xml:space="preserve">leave</w:t>
+      </w:r>
+      <w:r>
+        <w:t xml:space="preserve"> </w:t>
+      </w:r>
+      <w:r>
+        <w:t xml:space="preserve">the</w:t>
+      </w:r>
+      <w:r>
+        <w:t xml:space="preserve"> </w:t>
+      </w:r>
+      <w:r>
+        <w:t xml:space="preserve">pool</w:t>
+      </w:r>
+      <w:r>
+        <w:t xml:space="preserve"> </w:t>
+      </w:r>
+      <w:r>
+        <w:t xml:space="preserve">and</w:t>
+      </w:r>
+      <w:r>
+        <w:t xml:space="preserve"> </w:t>
+      </w:r>
+      <w:r>
+        <w:t xml:space="preserve">some</w:t>
+      </w:r>
+      <w:r>
+        <w:t xml:space="preserve"> </w:t>
+      </w:r>
+      <w:r>
+        <w:t xml:space="preserve">will</w:t>
+      </w:r>
+      <w:r>
+        <w:t xml:space="preserve"> </w:t>
+      </w:r>
+      <w:r>
+        <w:t xml:space="preserve">leave</w:t>
+      </w:r>
+      <w:r>
+        <w:t xml:space="preserve"> </w:t>
+      </w:r>
+      <w:r>
+        <w:t xml:space="preserve">unserved,</w:t>
+      </w:r>
+      <w:r>
+        <w:t xml:space="preserve"> </w:t>
+      </w:r>
+      <w:r>
+        <w:t xml:space="preserve">nobody</w:t>
+      </w:r>
+      <w:r>
+        <w:t xml:space="preserve"> </w:t>
+      </w:r>
+      <w:r>
+        <w:t xml:space="preserve">present</w:t>
+      </w:r>
+      <w:r>
+        <w:t xml:space="preserve"> </w:t>
+      </w:r>
+      <w:r>
+        <w:t xml:space="preserve">holds</w:t>
+      </w:r>
+      <w:r>
+        <w:t xml:space="preserve"> </w:t>
+      </w:r>
+      <w:r>
+        <w:t xml:space="preserve">a</w:t>
+      </w:r>
+      <w:r>
+        <w:t xml:space="preserve"> </w:t>
+      </w:r>
+      <w:r>
+        <w:t xml:space="preserve">surplus,</w:t>
+      </w:r>
+      <w:r>
+        <w:t xml:space="preserve"> </w:t>
+      </w:r>
+      <w:r>
+        <w:t xml:space="preserve">the</w:t>
+      </w:r>
+      <w:r>
+        <w:t xml:space="preserve"> </w:t>
+      </w:r>
+      <w:r>
+        <w:t xml:space="preserve">theory</w:t>
+      </w:r>
+      <w:r>
+        <w:t xml:space="preserve"> </w:t>
+      </w:r>
+      <w:r>
+        <w:t xml:space="preserve">fixes</w:t>
+      </w:r>
+      <w:r>
+        <w:t xml:space="preserve"> </w:t>
+      </w:r>
+      <w:r>
         <w:t xml:space="preserve">only</w:t>
       </w:r>
       <w:r>
         <w:t xml:space="preserve"> </w:t>
       </w:r>
       <w:r>
-        <w:t xml:space="preserve">through</w:t>
+        <w:t xml:space="preserve">the</w:t>
+      </w:r>
+      <w:r>
+        <w:t xml:space="preserve"> </w:t>
+      </w:r>
+      <w:r>
+        <w:t xml:space="preserve">frontier,</w:t>
+      </w:r>
+      <w:r>
+        <w:t xml:space="preserve"> </w:t>
+      </w:r>
+      <w:r>
+        <w:t xml:space="preserve">and</w:t>
+      </w:r>
+      <w:r>
+        <w:t xml:space="preserve"> </w:t>
+      </w:r>
+      <w:r>
+        <w:t xml:space="preserve">I</w:t>
+      </w:r>
+      <w:r>
+        <w:t xml:space="preserve"> </w:t>
+      </w:r>
+      <w:r>
+        <w:t xml:space="preserve">argue</w:t>
+      </w:r>
+      <w:r>
+        <w:t xml:space="preserve"> </w:t>
+      </w:r>
+      <w:r>
+        <w:t xml:space="preserve">for</w:t>
+      </w:r>
+      <w:r>
+        <w:t xml:space="preserve"> </w:t>
+      </w:r>
+      <w:r>
+        <w:t xml:space="preserve">its</w:t>
+      </w:r>
+      <w:r>
+        <w:t xml:space="preserve"> </w:t>
+      </w:r>
+      <w:r>
+        <w:t xml:space="preserve">forgetting</w:t>
+      </w:r>
+      <w:r>
+        <w:t xml:space="preserve"> </w:t>
+      </w:r>
+      <w:r>
+        <w:t xml:space="preserve">end.</w:t>
+      </w:r>
+      <w:r>
+        <w:t xml:space="preserve"> </w:t>
+      </w:r>
+      <w:r>
+        <w:t xml:space="preserve">Rules</w:t>
+      </w:r>
+      <w:r>
+        <w:t xml:space="preserve"> </w:t>
+      </w:r>
+      <w:r>
+        <w:t xml:space="preserve">that</w:t>
+      </w:r>
+      <w:r>
+        <w:t xml:space="preserve"> </w:t>
+      </w:r>
+      <w:r>
+        <w:t xml:space="preserve">forget</w:t>
+      </w:r>
+      <w:r>
+        <w:t xml:space="preserve"> </w:t>
+      </w:r>
+      <w:r>
+        <w:t xml:space="preserve">and</w:t>
+      </w:r>
+      <w:r>
+        <w:t xml:space="preserve"> </w:t>
+      </w:r>
+      <w:r>
+        <w:t xml:space="preserve">rules</w:t>
+      </w:r>
+      <w:r>
+        <w:t xml:space="preserve"> </w:t>
+      </w:r>
+      <w:r>
+        <w:t xml:space="preserve">that</w:t>
+      </w:r>
+      <w:r>
+        <w:t xml:space="preserve"> </w:t>
+      </w:r>
+      <w:r>
+        <w:t xml:space="preserve">remember</w:t>
+      </w:r>
+      <w:r>
+        <w:t xml:space="preserve"> </w:t>
+      </w:r>
+      <w:r>
+        <w:t xml:space="preserve">by</w:t>
+      </w:r>
+      <w:r>
+        <w:t xml:space="preserve"> </w:t>
+      </w:r>
+      <w:r>
+        <w:t xml:space="preserve">points</w:t>
+      </w:r>
+      <w:r>
+        <w:t xml:space="preserve"> </w:t>
+      </w:r>
+      <w:r>
+        <w:t xml:space="preserve">or</w:t>
+      </w:r>
+      <w:r>
+        <w:t xml:space="preserve"> </w:t>
+      </w:r>
+      <w:r>
+        <w:t xml:space="preserve">queues</w:t>
+      </w:r>
+      <w:r>
+        <w:t xml:space="preserve"> </w:t>
+      </w:r>
+      <w:r>
+        <w:t xml:space="preserve">are</w:t>
+      </w:r>
+      <w:r>
+        <w:t xml:space="preserve"> </w:t>
+      </w:r>
+      <w:r>
+        <w:t xml:space="preserve">both</w:t>
+      </w:r>
+      <w:r>
+        <w:t xml:space="preserve"> </w:t>
+      </w:r>
+      <w:r>
+        <w:t xml:space="preserve">unfair</w:t>
+      </w:r>
+      <w:r>
+        <w:t xml:space="preserve"> </w:t>
+      </w:r>
+      <w:r>
+        <w:t xml:space="preserve">where</w:t>
+      </w:r>
+      <w:r>
+        <w:t xml:space="preserve"> </w:t>
+      </w:r>
+      <w:r>
+        <w:t xml:space="preserve">the</w:t>
+      </w:r>
+      <w:r>
+        <w:t xml:space="preserve"> </w:t>
+      </w:r>
+      <w:r>
+        <w:t xml:space="preserve">good</w:t>
+      </w:r>
+      <w:r>
+        <w:t xml:space="preserve"> </w:t>
+      </w:r>
+      <w:r>
+        <w:t xml:space="preserve">recurs,</w:t>
+      </w:r>
+      <w:r>
+        <w:t xml:space="preserve"> </w:t>
+      </w:r>
+      <w:r>
+        <w:t xml:space="preserve">the</w:t>
+      </w:r>
+      <w:r>
+        <w:t xml:space="preserve"> </w:t>
+      </w:r>
+      <w:r>
+        <w:t xml:space="preserve">second</w:t>
+      </w:r>
+      <w:r>
+        <w:t xml:space="preserve"> </w:t>
+      </w:r>
+      <w:r>
+        <w:t xml:space="preserve">because</w:t>
       </w:r>
       <w:r>
         <w:t xml:space="preserve"> </w:t>
@@ -1081,121 +1621,73 @@
         <w:t xml:space="preserve"> </w:t>
       </w:r>
       <w:r>
-        <w:t xml:space="preserve">rule</w:t>
-      </w:r>
-      <w:r>
-        <w:t xml:space="preserve"> </w:t>
-      </w:r>
-      <w:r>
-        <w:t xml:space="preserve">whose</w:t>
-      </w:r>
-      <w:r>
-        <w:t xml:space="preserve"> </w:t>
-      </w:r>
-      <w:r>
-        <w:t xml:space="preserve">transfers</w:t>
-      </w:r>
-      <w:r>
-        <w:t xml:space="preserve"> </w:t>
-      </w:r>
-      <w:r>
-        <w:t xml:space="preserve">between</w:t>
-      </w:r>
-      <w:r>
-        <w:t xml:space="preserve"> </w:t>
-      </w:r>
-      <w:r>
-        <w:t xml:space="preserve">classes</w:t>
-      </w:r>
-      <w:r>
-        <w:t xml:space="preserve"> </w:t>
-      </w:r>
-      <w:r>
-        <w:t xml:space="preserve">of</w:t>
-      </w:r>
-      <w:r>
-        <w:t xml:space="preserve"> </w:t>
-      </w:r>
-      <w:r>
-        <w:t xml:space="preserve">claimants</w:t>
-      </w:r>
-      <w:r>
-        <w:t xml:space="preserve"> </w:t>
-      </w:r>
-      <w:r>
-        <w:t xml:space="preserve">are</w:t>
-      </w:r>
-      <w:r>
-        <w:t xml:space="preserve"> </w:t>
-      </w:r>
-      <w:r>
-        <w:t xml:space="preserve">a</w:t>
-      </w:r>
-      <w:r>
-        <w:t xml:space="preserve"> </w:t>
-      </w:r>
-      <w:r>
-        <w:t xml:space="preserve">by-product</w:t>
-      </w:r>
-      <w:r>
-        <w:t xml:space="preserve"> </w:t>
-      </w:r>
-      <w:r>
-        <w:t xml:space="preserve">of</w:t>
-      </w:r>
-      <w:r>
-        <w:t xml:space="preserve"> </w:t>
-      </w:r>
-      <w:r>
-        <w:t xml:space="preserve">a</w:t>
-      </w:r>
-      <w:r>
-        <w:t xml:space="preserve"> </w:t>
-      </w:r>
-      <w:r>
-        <w:t xml:space="preserve">past</w:t>
-      </w:r>
-      <w:r>
-        <w:t xml:space="preserve"> </w:t>
-      </w:r>
-      <w:r>
-        <w:t xml:space="preserve">winner’s</w:t>
-      </w:r>
-      <w:r>
-        <w:t xml:space="preserve"> </w:t>
-      </w:r>
-      <w:r>
-        <w:t xml:space="preserve">not</w:t>
-      </w:r>
-      <w:r>
-        <w:t xml:space="preserve"> </w:t>
-      </w:r>
-      <w:r>
-        <w:t xml:space="preserve">being</w:t>
-      </w:r>
-      <w:r>
-        <w:t xml:space="preserve"> </w:t>
-      </w:r>
-      <w:r>
-        <w:t xml:space="preserve">taxable,</w:t>
-      </w:r>
-      <w:r>
-        <w:t xml:space="preserve"> </w:t>
-      </w:r>
-      <w:r>
-        <w:t xml:space="preserve">never</w:t>
-      </w:r>
-      <w:r>
-        <w:t xml:space="preserve"> </w:t>
-      </w:r>
-      <w:r>
-        <w:t xml:space="preserve">its</w:t>
-      </w:r>
-      <w:r>
-        <w:t xml:space="preserve"> </w:t>
-      </w:r>
-      <w:r>
-        <w:t xml:space="preserve">mechanism,</w:t>
+        <w:t xml:space="preserve">gentler</w:t>
+      </w:r>
+      <w:r>
+        <w:t xml:space="preserve"> </w:t>
+      </w:r>
+      <w:r>
+        <w:t xml:space="preserve">memory</w:t>
+      </w:r>
+      <w:r>
+        <w:t xml:space="preserve"> </w:t>
+      </w:r>
+      <w:r>
+        <w:t xml:space="preserve">beats</w:t>
+      </w:r>
+      <w:r>
+        <w:t xml:space="preserve"> </w:t>
+      </w:r>
+      <w:r>
+        <w:t xml:space="preserve">them</w:t>
+      </w:r>
+      <w:r>
+        <w:t xml:space="preserve"> </w:t>
+      </w:r>
+      <w:r>
+        <w:t xml:space="preserve">on</w:t>
+      </w:r>
+      <w:r>
+        <w:t xml:space="preserve"> </w:t>
+      </w:r>
+      <w:r>
+        <w:t xml:space="preserve">every</w:t>
+      </w:r>
+      <w:r>
+        <w:t xml:space="preserve"> </w:t>
+      </w:r>
+      <w:r>
+        <w:t xml:space="preserve">count;</w:t>
+      </w:r>
+      <w:r>
+        <w:t xml:space="preserve"> </w:t>
+      </w:r>
+      <w:r>
+        <w:t xml:space="preserve">where</w:t>
+      </w:r>
+      <w:r>
+        <w:t xml:space="preserve"> </w:t>
+      </w:r>
+      <w:r>
+        <w:t xml:space="preserve">winners</w:t>
+      </w:r>
+      <w:r>
+        <w:t xml:space="preserve"> </w:t>
+      </w:r>
+      <w:r>
+        <w:t xml:space="preserve">leave</w:t>
+      </w:r>
+      <w:r>
+        <w:t xml:space="preserve"> </w:t>
+      </w:r>
+      <w:r>
+        <w:t xml:space="preserve">the</w:t>
+      </w:r>
+      <w:r>
+        <w:t xml:space="preserve"> </w:t>
+      </w:r>
+      <w:r>
+        <w:t xml:space="preserve">pool</w:t>
       </w:r>
       <w:r>
         <w:t xml:space="preserve"> </w:t>
@@ -1207,19 +1699,25 @@
         <w:t xml:space="preserve"> </w:t>
       </w:r>
       <w:r>
-        <w:t xml:space="preserve">only</w:t>
-      </w:r>
-      <w:r>
-        <w:t xml:space="preserve"> </w:t>
-      </w:r>
-      <w:r>
-        <w:t xml:space="preserve">up</w:t>
-      </w:r>
-      <w:r>
-        <w:t xml:space="preserve"> </w:t>
-      </w:r>
-      <w:r>
-        <w:t xml:space="preserve">to</w:t>
+        <w:t xml:space="preserve">some</w:t>
+      </w:r>
+      <w:r>
+        <w:t xml:space="preserve"> </w:t>
+      </w:r>
+      <w:r>
+        <w:t xml:space="preserve">will</w:t>
+      </w:r>
+      <w:r>
+        <w:t xml:space="preserve"> </w:t>
+      </w:r>
+      <w:r>
+        <w:t xml:space="preserve">leave</w:t>
+      </w:r>
+      <w:r>
+        <w:t xml:space="preserve"> </w:t>
+      </w:r>
+      <w:r>
+        <w:t xml:space="preserve">unserved,</w:t>
       </w:r>
       <w:r>
         <w:t xml:space="preserve"> </w:t>
@@ -1231,307 +1729,109 @@
         <w:t xml:space="preserve"> </w:t>
       </w:r>
       <w:r>
+        <w:t xml:space="preserve">queue</w:t>
+      </w:r>
+      <w:r>
+        <w:t xml:space="preserve"> </w:t>
+      </w:r>
+      <w:r>
+        <w:t xml:space="preserve">is</w:t>
+      </w:r>
+      <w:r>
+        <w:t xml:space="preserve"> </w:t>
+      </w:r>
+      <w:r>
+        <w:t xml:space="preserve">forbidden,</w:t>
+      </w:r>
+      <w:r>
+        <w:t xml:space="preserve"> </w:t>
+      </w:r>
+      <w:r>
+        <w:t xml:space="preserve">and</w:t>
+      </w:r>
+      <w:r>
+        <w:t xml:space="preserve"> </w:t>
+      </w:r>
+      <w:r>
+        <w:t xml:space="preserve">I</w:t>
+      </w:r>
+      <w:r>
+        <w:t xml:space="preserve"> </w:t>
+      </w:r>
+      <w:r>
+        <w:t xml:space="preserve">argue</w:t>
+      </w:r>
+      <w:r>
+        <w:t xml:space="preserve"> </w:t>
+      </w:r>
+      <w:r>
+        <w:t xml:space="preserve">that</w:t>
+      </w:r>
+      <w:r>
+        <w:t xml:space="preserve"> </w:t>
+      </w:r>
+      <w:r>
+        <w:t xml:space="preserve">the</w:t>
+      </w:r>
+      <w:r>
+        <w:t xml:space="preserve"> </w:t>
+      </w:r>
+      <w:r>
+        <w:t xml:space="preserve">lottery</w:t>
+      </w:r>
+      <w:r>
+        <w:t xml:space="preserve"> </w:t>
+      </w:r>
+      <w:r>
+        <w:t xml:space="preserve">that</w:t>
+      </w:r>
+      <w:r>
+        <w:t xml:space="preserve"> </w:t>
+      </w:r>
+      <w:r>
+        <w:t xml:space="preserve">forgets</w:t>
+      </w:r>
+      <w:r>
+        <w:t xml:space="preserve"> </w:t>
+      </w:r>
+      <w:r>
+        <w:t xml:space="preserve">is</w:t>
+      </w:r>
+      <w:r>
+        <w:t xml:space="preserve"> </w:t>
+      </w:r>
+      <w:r>
+        <w:t xml:space="preserve">fairer</w:t>
+      </w:r>
+      <w:r>
+        <w:t xml:space="preserve"> </w:t>
+      </w:r>
+      <w:r>
+        <w:t xml:space="preserve">than</w:t>
+      </w:r>
+      <w:r>
+        <w:t xml:space="preserve"> </w:t>
+      </w:r>
+      <w:r>
+        <w:t xml:space="preserve">any</w:t>
+      </w:r>
+      <w:r>
+        <w:t xml:space="preserve"> </w:t>
+      </w:r>
+      <w:r>
         <w:t xml:space="preserve">weight</w:t>
       </w:r>
       <w:r>
         <w:t xml:space="preserve"> </w:t>
       </w:r>
       <w:r>
-        <w:t xml:space="preserve">at</w:t>
-      </w:r>
-      <w:r>
-        <w:t xml:space="preserve"> </w:t>
-      </w:r>
-      <w:r>
-        <w:t xml:space="preserve">which</w:t>
-      </w:r>
-      <w:r>
-        <w:t xml:space="preserve"> </w:t>
-      </w:r>
-      <w:r>
-        <w:t xml:space="preserve">a</w:t>
-      </w:r>
-      <w:r>
-        <w:t xml:space="preserve"> </w:t>
-      </w:r>
-      <w:r>
-        <w:t xml:space="preserve">claimant</w:t>
-      </w:r>
-      <w:r>
-        <w:t xml:space="preserve"> </w:t>
-      </w:r>
-      <w:r>
-        <w:t xml:space="preserve">is</w:t>
-      </w:r>
-      <w:r>
-        <w:t xml:space="preserve"> </w:t>
-      </w:r>
-      <w:r>
-        <w:t xml:space="preserve">excluded</w:t>
-      </w:r>
-      <w:r>
-        <w:t xml:space="preserve"> </w:t>
-      </w:r>
-      <w:r>
-        <w:t xml:space="preserve">when</w:t>
-      </w:r>
-      <w:r>
-        <w:t xml:space="preserve"> </w:t>
-      </w:r>
-      <w:r>
-        <w:t xml:space="preserve">she</w:t>
-      </w:r>
-      <w:r>
-        <w:t xml:space="preserve"> </w:t>
-      </w:r>
-      <w:r>
-        <w:t xml:space="preserve">holds</w:t>
-      </w:r>
-      <w:r>
-        <w:t xml:space="preserve"> </w:t>
-      </w:r>
-      <w:r>
-        <w:t xml:space="preserve">a</w:t>
-      </w:r>
-      <w:r>
-        <w:t xml:space="preserve"> </w:t>
-      </w:r>
-      <w:r>
-        <w:t xml:space="preserve">whole</w:t>
-      </w:r>
-      <w:r>
-        <w:t xml:space="preserve"> </w:t>
-      </w:r>
-      <w:r>
-        <w:t xml:space="preserve">unit</w:t>
-      </w:r>
-      <w:r>
-        <w:t xml:space="preserve"> </w:t>
-      </w:r>
-      <w:r>
-        <w:t xml:space="preserve">of</w:t>
-      </w:r>
-      <w:r>
-        <w:t xml:space="preserve"> </w:t>
-      </w:r>
-      <w:r>
-        <w:t xml:space="preserve">another’s</w:t>
-      </w:r>
-      <w:r>
-        <w:t xml:space="preserve"> </w:t>
-      </w:r>
-      <w:r>
-        <w:t xml:space="preserve">share.</w:t>
-      </w:r>
-      <w:r>
-        <w:t xml:space="preserve"> </w:t>
-      </w:r>
-      <w:r>
-        <w:t xml:space="preserve">Where</w:t>
-      </w:r>
-      <w:r>
-        <w:t xml:space="preserve"> </w:t>
-      </w:r>
-      <w:r>
-        <w:t xml:space="preserve">the</w:t>
-      </w:r>
-      <w:r>
-        <w:t xml:space="preserve"> </w:t>
-      </w:r>
-      <w:r>
-        <w:t xml:space="preserve">good</w:t>
-      </w:r>
-      <w:r>
-        <w:t xml:space="preserve"> </w:t>
-      </w:r>
-      <w:r>
-        <w:t xml:space="preserve">recurs,</w:t>
-      </w:r>
-      <w:r>
-        <w:t xml:space="preserve"> </w:t>
-      </w:r>
-      <w:r>
-        <w:t xml:space="preserve">rules</w:t>
-      </w:r>
-      <w:r>
-        <w:t xml:space="preserve"> </w:t>
-      </w:r>
-      <w:r>
-        <w:t xml:space="preserve">that</w:t>
-      </w:r>
-      <w:r>
-        <w:t xml:space="preserve"> </w:t>
-      </w:r>
-      <w:r>
-        <w:t xml:space="preserve">forget</w:t>
-      </w:r>
-      <w:r>
-        <w:t xml:space="preserve"> </w:t>
-      </w:r>
-      <w:r>
-        <w:t xml:space="preserve">and</w:t>
-      </w:r>
-      <w:r>
-        <w:t xml:space="preserve"> </w:t>
-      </w:r>
-      <w:r>
-        <w:t xml:space="preserve">rules</w:t>
-      </w:r>
-      <w:r>
-        <w:t xml:space="preserve"> </w:t>
-      </w:r>
-      <w:r>
-        <w:t xml:space="preserve">that</w:t>
-      </w:r>
-      <w:r>
-        <w:t xml:space="preserve"> </w:t>
-      </w:r>
-      <w:r>
-        <w:t xml:space="preserve">remember</w:t>
-      </w:r>
-      <w:r>
-        <w:t xml:space="preserve"> </w:t>
-      </w:r>
-      <w:r>
-        <w:t xml:space="preserve">lexically</w:t>
-      </w:r>
-      <w:r>
-        <w:t xml:space="preserve"> </w:t>
-      </w:r>
-      <w:r>
-        <w:t xml:space="preserve">are</w:t>
-      </w:r>
-      <w:r>
-        <w:t xml:space="preserve"> </w:t>
-      </w:r>
-      <w:r>
-        <w:t xml:space="preserve">unfair</w:t>
-      </w:r>
-      <w:r>
-        <w:t xml:space="preserve"> </w:t>
-      </w:r>
-      <w:r>
-        <w:t xml:space="preserve">in</w:t>
-      </w:r>
-      <w:r>
-        <w:t xml:space="preserve"> </w:t>
-      </w:r>
-      <w:r>
-        <w:t xml:space="preserve">opposite</w:t>
-      </w:r>
-      <w:r>
-        <w:t xml:space="preserve"> </w:t>
-      </w:r>
-      <w:r>
-        <w:t xml:space="preserve">directions;</w:t>
-      </w:r>
-      <w:r>
-        <w:t xml:space="preserve"> </w:t>
-      </w:r>
-      <w:r>
-        <w:t xml:space="preserve">where</w:t>
-      </w:r>
-      <w:r>
-        <w:t xml:space="preserve"> </w:t>
-      </w:r>
-      <w:r>
-        <w:t xml:space="preserve">winners</w:t>
-      </w:r>
-      <w:r>
-        <w:t xml:space="preserve"> </w:t>
-      </w:r>
-      <w:r>
-        <w:t xml:space="preserve">leave</w:t>
-      </w:r>
-      <w:r>
-        <w:t xml:space="preserve"> </w:t>
-      </w:r>
-      <w:r>
-        <w:t xml:space="preserve">the</w:t>
-      </w:r>
-      <w:r>
-        <w:t xml:space="preserve"> </w:t>
-      </w:r>
-      <w:r>
-        <w:t xml:space="preserve">pool</w:t>
-      </w:r>
-      <w:r>
-        <w:t xml:space="preserve"> </w:t>
-      </w:r>
-      <w:r>
-        <w:t xml:space="preserve">and</w:t>
-      </w:r>
-      <w:r>
-        <w:t xml:space="preserve"> </w:t>
-      </w:r>
-      <w:r>
-        <w:t xml:space="preserve">some</w:t>
-      </w:r>
-      <w:r>
-        <w:t xml:space="preserve"> </w:t>
-      </w:r>
-      <w:r>
-        <w:t xml:space="preserve">will</w:t>
-      </w:r>
-      <w:r>
-        <w:t xml:space="preserve"> </w:t>
-      </w:r>
-      <w:r>
-        <w:t xml:space="preserve">leave</w:t>
-      </w:r>
-      <w:r>
-        <w:t xml:space="preserve"> </w:t>
-      </w:r>
-      <w:r>
-        <w:t xml:space="preserve">unserved,</w:t>
-      </w:r>
-      <w:r>
-        <w:t xml:space="preserve"> </w:t>
-      </w:r>
-      <w:r>
-        <w:t xml:space="preserve">the</w:t>
-      </w:r>
-      <w:r>
-        <w:t xml:space="preserve"> </w:t>
-      </w:r>
-      <w:r>
-        <w:t xml:space="preserve">lottery</w:t>
-      </w:r>
-      <w:r>
-        <w:t xml:space="preserve"> </w:t>
-      </w:r>
-      <w:r>
-        <w:t xml:space="preserve">that</w:t>
-      </w:r>
-      <w:r>
-        <w:t xml:space="preserve"> </w:t>
-      </w:r>
-      <w:r>
-        <w:t xml:space="preserve">forgets</w:t>
-      </w:r>
-      <w:r>
-        <w:t xml:space="preserve"> </w:t>
-      </w:r>
-      <w:r>
-        <w:t xml:space="preserve">is</w:t>
-      </w:r>
-      <w:r>
-        <w:t xml:space="preserve"> </w:t>
-      </w:r>
-      <w:r>
-        <w:t xml:space="preserve">what</w:t>
-      </w:r>
-      <w:r>
-        <w:t xml:space="preserve"> </w:t>
-      </w:r>
-      <w:r>
-        <w:t xml:space="preserve">fairness</w:t>
-      </w:r>
-      <w:r>
-        <w:t xml:space="preserve"> </w:t>
-      </w:r>
-      <w:r>
-        <w:t xml:space="preserve">requires.</w:t>
+        <w:t xml:space="preserve">on</w:t>
+      </w:r>
+      <w:r>
+        <w:t xml:space="preserve"> </w:t>
+      </w:r>
+      <w:r>
+        <w:t xml:space="preserve">waiting.</w:t>
       </w:r>
     </w:p>
     <w:bookmarkStart w:id="23" w:name="two-lotteries"/>
@@ -1971,7 +2271,7 @@
         <w:t xml:space="preserve"> </w:t>
       </w:r>
       <w:r>
-        <w:t xml:space="preserve">history-dependence is an axiom. What follows adds the derivation inside Broome’s theory, against his own extinction thesis; the constraint on how hard memory may press; and the structure in which it is forbidden.</w:t>
+        <w:t xml:space="preserve">history-dependence is an axiom. What follows adds the derivation inside Broome’s theory, against his own extinction thesis; the constraint on how hard memory may press; and the structure in which it is all but forbidden.</w:t>
       </w:r>
     </w:p>
     <w:p>
@@ -2018,7 +2318,7 @@
         <w:t xml:space="preserve">Currency and weight</w:t>
       </w:r>
       <w:r>
-        <w:t xml:space="preserve">: what memory tracks is a claimant’s shortfall from her fair share, in units of the good where a later unit is as good to her as an earlier one and in waiting where it is not; and it may press that shortfall only through a rule whose transfers between classes of claimants are a by-product, not its mechanism, and only up to the weight at which a claimant is excluded when she holds a whole unit of another’s share.</w:t>
+        <w:t xml:space="preserve">: what memory tracks is a claimant’s shortfall from her fair share, in units of the good where a later unit is as good to her as an earlier one and in waiting where it is not; and it may press that shortfall only as far as the chance owed to those who may leave before the division reaches them allows, the two weighed in Broome’s own manner.</w:t>
       </w:r>
     </w:p>
     <w:bookmarkEnd w:id="23"/>
@@ -2388,7 +2688,7 @@
         <w:t xml:space="preserve"> </w:t>
       </w:r>
       <w:r>
-        <w:t xml:space="preserve">units, or as near as the integers allow. Call the procedure that does so</w:t>
+        <w:t xml:space="preserve">units, or as near as the integers allow. Call this</w:t>
       </w:r>
       <w:r>
         <w:t xml:space="preserve"> </w:t>
@@ -2401,7 +2701,7 @@
         <w:t xml:space="preserve">rotation</w:t>
       </w:r>
       <w:r>
-        <w:t xml:space="preserve">: draw a random order once and cycle through it. Rotation is, in the sequence, what dividing the food is in the single case. The sequence can be divided, so fairness requires rotation, or whatever comes as close to it as circumstances allow.</w:t>
+        <w:t xml:space="preserve">: a random order drawn once and cycled. Rotation is, in the sequence, what dividing the food is in the single case. The sequence can be divided, so fairness requires rotation, or whatever comes as close to it as circumstances allow.</w:t>
       </w:r>
     </w:p>
     <w:p>
@@ -2774,7 +3074,7 @@
         <w:t xml:space="preserve"> </w:t>
       </w:r>
       <w:r>
-        <w:t xml:space="preserve">standing that is protected when new claimants arrive.</w:t>
+        <w:t xml:space="preserve">standing that is protected when new claimants arrive, and Broome himself, Vong reports (p. 481), suggested adjusting later lotteries’ probabilities in the winner’s favour so that every claimant has an appropriate chance of benefiting.</w:t>
       </w:r>
     </w:p>
     <w:p>
@@ -2857,7 +3157,7 @@
       </w:r>
     </w:p>
     <w:bookmarkEnd w:id="28"/>
-    <w:bookmarkStart w:id="33" w:name="what-memory-tracks"/>
+    <w:bookmarkStart w:id="32" w:name="what-memory-tracks"/>
     <w:p>
       <w:pPr>
         <w:pStyle w:val="Heading1"/>
@@ -3346,7 +3646,7 @@
         <w:pStyle w:val="BodyText"/>
       </w:pPr>
       <w:r>
-        <w:t xml:space="preserve">The rule has near relatives. Lackner’s</w:t>
+        <w:t xml:space="preserve">The rule has a near relative. Lackner’s</w:t>
       </w:r>
       <w:r>
         <w:t xml:space="preserve"> </w:t>
@@ -3359,7 +3659,7 @@
           <w:rPr>
             <w:rStyle w:val="Hyperlink"/>
           </w:rPr>
-          <w:t xml:space="preserve">2020</w:t>
+          <w:t xml:space="preserve">2020, 2106</w:t>
         </w:r>
       </w:hyperlink>
       <w:r>
@@ -3369,25 +3669,7 @@
         <w:t xml:space="preserve"> </w:t>
       </w:r>
       <w:r>
-        <w:t xml:space="preserve">perpetual voting rules weight voters by the history of past decisions, since</w:t>
-      </w:r>
-      <w:r>
-        <w:t xml:space="preserve"> </w:t>
-      </w:r>
-      <w:r>
-        <w:t xml:space="preserve">“</w:t>
-      </w:r>
-      <w:r>
-        <w:t xml:space="preserve">only due to this dependency we can achieve fairness over time</w:t>
-      </w:r>
-      <w:r>
-        <w:t xml:space="preserve">”</w:t>
-      </w:r>
-      <w:r>
-        <w:t xml:space="preserve"> </w:t>
-      </w:r>
-      <w:r>
-        <w:t xml:space="preserve">(2104); his Perpetual Quota weights each by</w:t>
+        <w:t xml:space="preserve">Perpetual Quota weights each voter by</w:t>
       </w:r>
       <w:r>
         <w:t xml:space="preserve"> </w:t>
@@ -3443,10 +3725,7 @@
         </m:d>
       </m:oMath>
       <w:r>
-        <w:t xml:space="preserve"> </w:t>
-      </w:r>
-      <w:r>
-        <w:t xml:space="preserve">(2106), which in my setting is shortfall. But his rules are deterministic, so here Perpetual Quota</w:t>
+        <w:t xml:space="preserve">, which in my setting is shortfall; but his rules are deterministic, so here it</w:t>
       </w:r>
       <w:r>
         <w:t xml:space="preserve"> </w:t>
@@ -3462,41 +3741,7 @@
         <w:t xml:space="preserve"> </w:t>
       </w:r>
       <w:r>
-        <w:t xml:space="preserve">rotation in its tie-breaking order, and the memoryless lottery enters only as a benchmark (2109). The lottery with memory lies between, and the theory of claims requires it, since an arbitrary fixed order among equal claims is what it forbids. Rules weighting by losses alone fail even simple proportionality</w:t>
-      </w:r>
-      <w:r>
-        <w:t xml:space="preserve"> </w:t>
-      </w:r>
-      <w:r>
-        <w:t xml:space="preserve">(</w:t>
-      </w:r>
-      <w:hyperlink w:anchor="ref-Lackner2020">
-        <w:r>
-          <w:rPr>
-            <w:rStyle w:val="Hyperlink"/>
-          </w:rPr>
-          <w:t xml:space="preserve">Lackner 2020</w:t>
-        </w:r>
-      </w:hyperlink>
-      <w:r>
-        <w:t xml:space="preserve">, Prop. 1;</w:t>
-      </w:r>
-      <w:r>
-        <w:t xml:space="preserve"> </w:t>
-      </w:r>
-      <w:hyperlink w:anchor="ref-LacknerMaly2023">
-        <w:r>
-          <w:rPr>
-            <w:rStyle w:val="Hyperlink"/>
-          </w:rPr>
-          <w:t xml:space="preserve">Lackner and Maly 2023</w:t>
-        </w:r>
-      </w:hyperlink>
-      <w:r>
-        <w:t xml:space="preserve">, Thm. 2)</w:t>
-      </w:r>
-      <w:r>
-        <w:t xml:space="preserve">, a deterministic analogue of the failure of points-for-losses.</w:t>
+        <w:t xml:space="preserve">rotation in its tie-breaking order, an arbitrary fixed order among equal claims, which the theory of claims forbids.</w:t>
       </w:r>
     </w:p>
     <w:bookmarkEnd w:id="29"/>
@@ -3514,7 +3759,7 @@
         <w:pStyle w:val="FirstParagraph"/>
       </w:pPr>
       <w:r>
-        <w:t xml:space="preserve">Once claimants come and go, a real objection appears. A newcomer has as much of her claim outstanding as any past loser had on first application, and may be gone before the division reaches her; under any rule with memory she is given a smaller chance than that loser now has.</w:t>
+        <w:t xml:space="preserve">Once claimants come and go, an objection appears. A newcomer has as much of her claim outstanding as any past loser had on first application, and may be gone before the division reaches her; under any rule with memory she is given a smaller chance than that loser now has.</w:t>
       </w:r>
     </w:p>
     <w:p>
@@ -3522,7 +3767,7 @@
         <w:pStyle w:val="BodyText"/>
       </w:pPr>
       <w:r>
-        <w:t xml:space="preserve">The answer also fixes how heavily memory may press. Division of the sequence is available only to a claimant who stays long enough for it to be completed; one who leaves after three periods cannot be given three-tenths of a tag; for her the sequence is as indivisible as the unit. If the allocator knew who would leave, it would owe them the surrogate outright: a chance, each period, proportional to their claim. Not knowing, it owes the surrogate to everyone, in the only form available: that no claimant’s expected share, over whatever tenure she turns out to have, fall short of proportionality. Call this the</w:t>
+        <w:t xml:space="preserve">The answer also fixes how heavily memory may press. Division of the sequence is available only to a claimant who stays long enough for it to be completed; one who leaves after three periods cannot be given three-tenths of a tag; for her the sequence is as indivisible as the unit. If the allocator knew who would leave, it would owe them the surrogate outright, a chance each period proportional to their claim, since a whole unit is more than their share. Not knowing, it owes the surrogate to everyone, in the only form available: that no claimant’s expected share, over whatever tenure she turns out to have, depart from proportionality. Call this the</w:t>
       </w:r>
       <w:r>
         <w:t xml:space="preserve"> </w:t>
@@ -3548,20 +3793,45 @@
         <w:t xml:space="preserve">owed</w:t>
       </w:r>
       <w:r>
-        <w:t xml:space="preserve">, and a rule that takes it from her to smooth the shares of those who stay overrides her claim, whereas the dispersion it would smooth is the residue of a lottery, which the standard theory already</w:t>
-      </w:r>
-      <w:r>
-        <w:t xml:space="preserve"> </w:t>
-      </w:r>
-      <w:r>
-        <w:rPr>
-          <w:iCs/>
-          <w:i/>
-        </w:rPr>
-        <w:t xml:space="preserve">tolerates</w:t>
-      </w:r>
-      <w:r>
-        <w:t xml:space="preserve">. That ranking is mine, not Broome’s, though it rests on his distinction between a claim overridden and a claim met in part; and since the surrogate is owed to each claimant who may leave, not to a class, their number does not bear on whether it is owed.</w:t>
+        <w:t xml:space="preserve">; the dispersion among those who stay is what the Division Principle measures. Where neither departure from proportional satisfaction can be reduced without increasing the other they must be weighed. That is how Broome himself treats the fairness a lottery contributes and the less fair result it is likely to produce: the likelihood of the one</w:t>
+      </w:r>
+      <w:r>
+        <w:t xml:space="preserve"> </w:t>
+      </w:r>
+      <w:r>
+        <w:t xml:space="preserve">“</w:t>
+      </w:r>
+      <w:r>
+        <w:t xml:space="preserve">will have to be weighed against</w:t>
+      </w:r>
+      <w:r>
+        <w:t xml:space="preserve">”</w:t>
+      </w:r>
+      <w:r>
+        <w:t xml:space="preserve"> </w:t>
+      </w:r>
+      <w:r>
+        <w:t xml:space="preserve">the other</w:t>
+      </w:r>
+      <w:r>
+        <w:t xml:space="preserve"> </w:t>
+      </w:r>
+      <w:r>
+        <w:t xml:space="preserve">(</w:t>
+      </w:r>
+      <w:hyperlink w:anchor="ref-Broome1991a">
+        <w:r>
+          <w:rPr>
+            <w:rStyle w:val="Hyperlink"/>
+          </w:rPr>
+          <w:t xml:space="preserve">1991a, 99</w:t>
+        </w:r>
+      </w:hyperlink>
+      <w:r>
+        <w:t xml:space="preserve">)</w:t>
+      </w:r>
+      <w:r>
+        <w:t xml:space="preserve">. The third claim uses that method and nothing stronger.</w:t>
       </w:r>
     </w:p>
     <w:p>
@@ -3822,122 +4092,7 @@
         <w:t xml:space="preserve"> </w:t>
       </w:r>
       <w:r>
-        <w:t xml:space="preserve">a claimant far enough ahead of the pool wins with positive probability, her chance cannot fall below zero, and her unpaid share then falls on everyone, the newcomer included. So the constraint, read as a floor no class may ever fall below, admits no memory under churn, only forgetting. That reading mistakes what the floor protects. What the newcomer is owed is that her chance not be the</w:t>
-      </w:r>
-      <w:r>
-        <w:t xml:space="preserve"> </w:t>
-      </w:r>
-      <w:r>
-        <w:rPr>
-          <w:iCs/>
-          <w:i/>
-        </w:rPr>
-        <w:t xml:space="preserve">mechanism</w:t>
-      </w:r>
-      <w:r>
-        <w:t xml:space="preserve"> </w:t>
-      </w:r>
-      <w:r>
-        <w:t xml:space="preserve">by which the stayers’ shares are smoothed. Under the shortfall rule it is not: the smoothing is done within each claimant’s own stay, by moving her chance from periods when she is ahead to periods when she is behind, and the leak to other classes is the by-product of a boundary, her not being taxable; without the boundary it is zero at every</w:t>
-      </w:r>
-      <w:r>
-        <w:t xml:space="preserve"> </w:t>
-      </w:r>
-      <m:oMath>
-        <m:r>
-          <m:t>κ</m:t>
-        </m:r>
-      </m:oMath>
-      <w:r>
-        <w:t xml:space="preserve">, and as</w:t>
-      </w:r>
-      <w:r>
-        <w:t xml:space="preserve"> </w:t>
-      </w:r>
-      <m:oMath>
-        <m:r>
-          <m:t>κ</m:t>
-        </m:r>
-      </m:oMath>
-      <w:r>
-        <w:t xml:space="preserve"> </w:t>
-      </w:r>
-      <w:r>
-        <w:t xml:space="preserve">falls it shrinks faster than any power of</w:t>
-      </w:r>
-      <w:r>
-        <w:t xml:space="preserve"> </w:t>
-      </w:r>
-      <m:oMath>
-        <m:r>
-          <m:t>κ</m:t>
-        </m:r>
-      </m:oMath>
-      <w:r>
-        <w:t xml:space="preserve"> </w:t>
-      </w:r>
-      <w:r>
-        <w:t xml:space="preserve">while the smoothing shrinks only in proportion. Under points, queues and years-since-a-win the transfer from short tenures to long is the mechanism itself: it does not vanish as the weight falls, and there is no boundary to blame. That is the difference in kind the constraint marks, and it separates recurrence from the bottleneck of §5.1, where nobody present has received a unit, so that any smoothing of waiting is transfer between claimants and nothing else. It fixes the kind of rule; the unit fixes the weight. A claimant’s chance reaches zero when she is</w:t>
-      </w:r>
-      <w:r>
-        <w:t xml:space="preserve"> </w:t>
-      </w:r>
-      <m:oMath>
-        <m:r>
-          <m:t>1</m:t>
-        </m:r>
-        <m:r>
-          <m:rPr>
-            <m:sty m:val="p"/>
-          </m:rPr>
-          <m:t>/</m:t>
-        </m:r>
-        <m:r>
-          <m:t>κ</m:t>
-        </m:r>
-      </m:oMath>
-      <w:r>
-        <w:t xml:space="preserve"> </w:t>
-      </w:r>
-      <w:r>
-        <w:t xml:space="preserve">units ahead of the pool, and the Division Principle counts in units; so at</w:t>
-      </w:r>
-      <w:r>
-        <w:t xml:space="preserve"> </w:t>
-      </w:r>
-      <m:oMath>
-        <m:r>
-          <m:t>κ</m:t>
-        </m:r>
-        <m:r>
-          <m:rPr>
-            <m:sty m:val="p"/>
-          </m:rPr>
-          <m:t>=</m:t>
-        </m:r>
-        <m:r>
-          <m:t>1</m:t>
-        </m:r>
-      </m:oMath>
-      <w:r>
-        <w:t xml:space="preserve"> </w:t>
-      </w:r>
-      <w:r>
-        <w:t xml:space="preserve">exclusion begins exactly when she holds a whole unit that is someone else’s share, a larger</w:t>
-      </w:r>
-      <w:r>
-        <w:t xml:space="preserve"> </w:t>
-      </w:r>
-      <m:oMath>
-        <m:r>
-          <m:t>κ</m:t>
-        </m:r>
-      </m:oMath>
-      <w:r>
-        <w:t xml:space="preserve"> </w:t>
-      </w:r>
-      <w:r>
-        <w:t xml:space="preserve">excludes for fractions of the indivisible unit, and a smaller one leaves a chance with someone who already holds another’s unit. Table 1 shows the sizes.</w:t>
+        <w:t xml:space="preserve">a claimant far enough ahead of the pool wins with positive probability, her chance cannot fall below zero, and her unpaid share then falls on everyone, the newcomer included. So no rule with memory meets the constraint exactly under churn, and the weighing cannot be avoided. What each rule costs the leavers and buys the stayers, Table 1 shows.</w:t>
       </w:r>
     </w:p>
     <w:p>
@@ -4709,7 +4864,7 @@
         <w:pStyle w:val="BodyText"/>
       </w:pPr>
       <w:r>
-        <w:t xml:space="preserve">The leak costs the newcomer three hundredths of one per cent at</w:t>
+        <w:t xml:space="preserve">The exchange is lopsided. The leak costs the newcomer three hundredths of one per cent of a period’s chance at</w:t>
       </w:r>
       <w:r>
         <w:t xml:space="preserve"> </w:t>
@@ -4738,7 +4893,10 @@
         </m:r>
       </m:oMath>
       <w:r>
-        <w:t xml:space="preserve">, under one per cent at</w:t>
+        <w:t xml:space="preserve"> </w:t>
+      </w:r>
+      <w:r>
+        <w:t xml:space="preserve">and under one per cent at</w:t>
       </w:r>
       <w:r>
         <w:t xml:space="preserve"> </w:t>
@@ -4758,7 +4916,7 @@
         </m:r>
       </m:oMath>
       <w:r>
-        <w:t xml:space="preserve">, six per cent at</w:t>
+        <w:t xml:space="preserve">, against reductions in dispersion of a quarter and over a third: in units of the good, a hundredth of a unit over a ten-period stay against a third of one. No weighing that counts both can prefer the forgetting rule. At</w:t>
       </w:r>
       <w:r>
         <w:t xml:space="preserve"> </w:t>
@@ -4781,7 +4939,7 @@
         <w:t xml:space="preserve"> </w:t>
       </w:r>
       <w:r>
-        <w:t xml:space="preserve">and nearly half her chance at</w:t>
+        <w:t xml:space="preserve">and</w:t>
       </w:r>
       <w:r>
         <w:t xml:space="preserve"> </w:t>
@@ -4801,7 +4959,10 @@
         </m:r>
       </m:oMath>
       <w:r>
-        <w:t xml:space="preserve">, against reductions in dispersion of a quarter, over a third, nearly a half and over a half.</w:t>
+        <w:t xml:space="preserve"> </w:t>
+      </w:r>
+      <w:r>
+        <w:t xml:space="preserve">the leak is six per cent and nearly half, and the exchange becomes a real one.</w:t>
       </w:r>
     </w:p>
     <w:p>
@@ -4809,15 +4970,7 @@
         <w:pStyle w:val="BodyText"/>
       </w:pPr>
       <w:r>
-        <w:t xml:space="preserve">The rules in use breach the constraint outright. Linear points give a newcomer a quarter of the chance her claim warrants and a claimant who stays thirty periods 15 per cent more than her share; squared points cut the newcomer to a twelfth; a queue gives her nothing, and whoever leaves early leaves with nothing. These rules reduce dispersion, some by more than the moderate shortfall rules, but transfer from short tenures to long is their mechanism, which denies the short-stayers the surrogate they are owed. The Grand Canyon’s rule errs the other way: starting a newcomer at the cap gives her a sixth more than her share, which by conservation the others pay for.</w:t>
-      </w:r>
-    </w:p>
-    <w:p>
-      <w:pPr>
-        <w:pStyle w:val="BodyText"/>
-      </w:pPr>
-      <w:r>
-        <w:t xml:space="preserve">So, in recurrence, the third claim is established. Memory is required, through a rule whose transfer between classes is the by-product of non-taxability rather than its mechanism; the rules in use, whose mechanism it is, fail, and to remember lexically lets an incumbent’s accumulated claim override a newcomer’s present one. Within the kind, the unit fixes the weight: at</w:t>
+        <w:t xml:space="preserve">In Table 1’s setting the rules in use are not on that exchange at all: each is dominated. Linear points give a newcomer a quarter of the chance her claim warrants and a claimant who stays thirty periods 15 per cent more than her share, with more dispersion than</w:t>
       </w:r>
       <w:r>
         <w:t xml:space="preserve"> </w:t>
@@ -4837,14 +4990,179 @@
         </m:r>
       </m:oMath>
       <w:r>
-        <w:t xml:space="preserve"> </w:t>
-      </w:r>
-      <w:r>
-        <w:t xml:space="preserve">a claimant is excluded exactly when she holds a whole unit of another’s share, every tenure class stays within one per cent of its own, and over a third of the dispersion goes. The residual lottery is the surrogate the short-stayers are owed. Only where the pool is fixed is it zero, and there the rule is rotation.</w:t>
+        <w:t xml:space="preserve">; squared points cut the newcomer to a twelfth, with more dispersion than</w:t>
+      </w:r>
+      <w:r>
+        <w:t xml:space="preserve"> </w:t>
+      </w:r>
+      <m:oMath>
+        <m:r>
+          <m:t>κ</m:t>
+        </m:r>
+        <m:r>
+          <m:rPr>
+            <m:sty m:val="p"/>
+          </m:rPr>
+          <m:t>=</m:t>
+        </m:r>
+        <m:r>
+          <m:t>2</m:t>
+        </m:r>
+      </m:oMath>
+      <w:r>
+        <w:t xml:space="preserve">; a queue gives her nothing, and whoever leaves early leaves with nothing, with more dispersion than</w:t>
+      </w:r>
+      <w:r>
+        <w:t xml:space="preserve"> </w:t>
+      </w:r>
+      <m:oMath>
+        <m:r>
+          <m:t>κ</m:t>
+        </m:r>
+        <m:r>
+          <m:rPr>
+            <m:sty m:val="p"/>
+          </m:rPr>
+          <m:t>=</m:t>
+        </m:r>
+        <m:r>
+          <m:t>10</m:t>
+        </m:r>
+      </m:oMath>
+      <w:r>
+        <w:t xml:space="preserve">; the Grand Canyon’s rule gives her a sixth more than her share, which by conservation the others pay for, with more dispersion than</w:t>
+      </w:r>
+      <w:r>
+        <w:t xml:space="preserve"> </w:t>
+      </w:r>
+      <m:oMath>
+        <m:r>
+          <m:t>κ</m:t>
+        </m:r>
+        <m:r>
+          <m:rPr>
+            <m:sty m:val="p"/>
+          </m:rPr>
+          <m:t>=</m:t>
+        </m:r>
+        <m:r>
+          <m:t>1</m:t>
+        </m:r>
+        <m:r>
+          <m:rPr>
+            <m:sty m:val="p"/>
+          </m:rPr>
+          <m:t>/</m:t>
+        </m:r>
+        <m:r>
+          <m:t>2</m:t>
+        </m:r>
+      </m:oMath>
+      <w:r>
+        <w:t xml:space="preserve">. For each there is a shortfall rule that does better by the newcomer and on dispersion at once, so each is forbidden whatever weight those two are given.</w:t>
+      </w:r>
+    </w:p>
+    <w:p>
+      <w:pPr>
+        <w:pStyle w:val="BodyText"/>
+      </w:pPr>
+      <w:r>
+        <w:t xml:space="preserve">Within the family the weight is a genuine choice, and the theory fixes the frontier rather than the point on it. One point is salient in its own currency. A claimant’s chance reaches zero when she is</w:t>
+      </w:r>
+      <w:r>
+        <w:t xml:space="preserve"> </w:t>
+      </w:r>
+      <m:oMath>
+        <m:r>
+          <m:t>1</m:t>
+        </m:r>
+        <m:r>
+          <m:rPr>
+            <m:sty m:val="p"/>
+          </m:rPr>
+          <m:t>/</m:t>
+        </m:r>
+        <m:r>
+          <m:t>κ</m:t>
+        </m:r>
+      </m:oMath>
+      <w:r>
+        <w:t xml:space="preserve"> </w:t>
+      </w:r>
+      <w:r>
+        <w:t xml:space="preserve">units ahead of the pool, and the Division Principle counts in units; at</w:t>
+      </w:r>
+      <w:r>
+        <w:t xml:space="preserve"> </w:t>
+      </w:r>
+      <m:oMath>
+        <m:r>
+          <m:t>κ</m:t>
+        </m:r>
+        <m:r>
+          <m:rPr>
+            <m:sty m:val="p"/>
+          </m:rPr>
+          <m:t>=</m:t>
+        </m:r>
+        <m:r>
+          <m:t>1</m:t>
+        </m:r>
+      </m:oMath>
+      <w:r>
+        <w:t xml:space="preserve"> </w:t>
+      </w:r>
+      <w:r>
+        <w:t xml:space="preserve">exclusion begins exactly when she holds a whole unit that is someone else’s share, a larger</w:t>
+      </w:r>
+      <w:r>
+        <w:t xml:space="preserve"> </w:t>
+      </w:r>
+      <m:oMath>
+        <m:r>
+          <m:t>κ</m:t>
+        </m:r>
+      </m:oMath>
+      <w:r>
+        <w:t xml:space="preserve"> </w:t>
+      </w:r>
+      <w:r>
+        <w:t xml:space="preserve">excludes for fractions of the indivisible unit, and a smaller one leaves a chance with someone who already holds another’s unit. I adopt it.</w:t>
+      </w:r>
+    </w:p>
+    <w:p>
+      <w:pPr>
+        <w:pStyle w:val="BodyText"/>
+      </w:pPr>
+      <w:r>
+        <w:t xml:space="preserve">So, in recurrence, the third claim is established. Memory is required: the forgetting rule gives up a third of the division for a leak too small to weigh. To remember by points or by queue is forbidden: in Table 1’s setting each such rule is beaten on both counts by one that remembers less harshly, and where units per stay are few, so that the queue can join the frontier, it is excluded by the argument of §5.1 instead. At</w:t>
+      </w:r>
+      <w:r>
+        <w:t xml:space="preserve"> </w:t>
+      </w:r>
+      <m:oMath>
+        <m:r>
+          <m:t>κ</m:t>
+        </m:r>
+        <m:r>
+          <m:rPr>
+            <m:sty m:val="p"/>
+          </m:rPr>
+          <m:t>=</m:t>
+        </m:r>
+        <m:r>
+          <m:t>1</m:t>
+        </m:r>
+      </m:oMath>
+      <w:r>
+        <w:t xml:space="preserve"> </w:t>
+      </w:r>
+      <w:r>
+        <w:t xml:space="preserve">every tenure class stays within one per cent of its share; the residual lottery is the surrogate the short-stayers are owed. Only where the pool is fixed is it zero, and there the rule is rotation.</w:t>
       </w:r>
     </w:p>
     <w:bookmarkEnd w:id="30"/>
-    <w:bookmarkStart w:id="32" w:name="bottlenecks-and-waiting"/>
+    <w:bookmarkStart w:id="31" w:name="bottlenecks-and-waiting"/>
     <w:p>
       <w:pPr>
         <w:pStyle w:val="Heading2"/>
@@ -4858,7 +5176,7 @@
         <w:pStyle w:val="FirstParagraph"/>
       </w:pPr>
       <w:r>
-        <w:t xml:space="preserve">In a bottleneck nobody accumulates more than one unit; what varies is time waited. Fungibility fails, because each claim is to one unit and to having it soon; what is divisible is the waiting. Under the forgetting rule, waiting is raffled: with a pool of ten kept full by arrivals and one unit per period, about one in seventy waits forty periods or more, though everyone’s expected wait is nine. A queue serves everyone at nine. Time, unlike a flat, is divisible, so the Division Principle applies to the waiting and says: equalize it. This is why John and Millum</w:t>
+        <w:t xml:space="preserve">In a bottleneck nobody accumulates more than one unit; what varies is time waited. Fungibility fails, because each claim is to one unit and to having it soon; what is divisible is the waiting. Under the forgetting rule, waiting is raffled: with a pool of ten kept full by arrivals and one unit per period, about one in seventy waits forty periods or more, though everyone’s expected wait is nine; a queue serves everyone at nine. Time, unlike a flat, is divisible, so the Division Principle applies to the waiting and says: equalize it. This is why John and Millum</w:t>
       </w:r>
       <w:r>
         <w:t xml:space="preserve"> </w:t>
@@ -4948,19 +5266,43 @@
         <w:pStyle w:val="BodyText"/>
       </w:pPr>
       <w:r>
-        <w:t xml:space="preserve">The surrogate constraint carries over, and here it cuts the other way. Where claimants may leave unserved, by dying or losing eligibility, and the allocator cannot tell who, those to whom the division is not available are owed the surrogate: an equal chance, each period, at the unit. A pure queue denies it outright; so, to a degree, does any rule that weights by time waited. In recurrence the transfer between classes was the by-product of a boundary; absent clipping the shortfall rule gives every tenure class its share. In a bottleneck there is no boundary to blame: nobody present has received a unit, so the shortfall rule itself reduces to forgetting, and a rule that weights by waiting takes from the newcomer by its mechanism, whatever the weight. So the result is two-sided a second way. Where everyone will be served, the waiting is divisible and fairness requires a queue; where some will leave unserved and the allocator cannot tell who, fairness requires the lottery that forgets. Memory is required in one structure and forbidden in the other; the difference is whether a claimant’s own stay has periods to move a chance between. Housing lists and transplant lists, where some always leave unserved, fall on the second side so far as exit is unforeseeable. Where it is foreseeable, or rises with waiting, the claim is urgent, time waited is evidence of urgency, and the rule must weight it, as transplant allocation does: a difference in claims, not a memory of history. (Bighorn ram tags, which New Mexico issues once in a lifetime,</w:t>
-      </w:r>
-      <w:r>
-        <w:rPr>
-          <w:rStyle w:val="FootnoteReference"/>
-        </w:rPr>
-        <w:footnoteReference w:id="31"/>
-      </w:r>
-      <w:r>
-        <w:t xml:space="preserve"> </w:t>
-      </w:r>
-      <w:r>
-        <w:t xml:space="preserve">are a bottleneck; there New Mexico’s rule is right.)</w:t>
+        <w:t xml:space="preserve">The surrogate constraint carries over, and here it cuts the other way. Where claimants may leave unserved, by dying or losing eligibility, and the allocator cannot tell who, those to whom the division is not available are owed the surrogate: an equal chance, each period, at the unit. In recurrence the leavers paid almost nothing for memory because the stayers’ own past wins paid for it. In a bottleneck nobody present has received a unit, so there is no surplus to draw on: the shortfall rule itself reduces to forgetting, and every unit of chance a rule gives to a long waiter is taken from someone whose claim is wholly outstanding. The frontier is correspondingly steep. With a pool of ten, one unit a period and one claimant in a hundred leaving unserved each period, a queue gives a newcomer no chance and the served a spread of waits under a period; a mild weight on waiting gives her three-fifths of her chance and the served a spread of six and a half periods; forgetting gives her the whole of it and a spread of nearly nine. The fraction who leave unserved is the same under all three, since chances sum to one; what the rules choose is who they are. The weighing is a different one too. What a weight on waiting buys is equal waiting among people who will all be served; what it costs is the chance of the good itself to those who will not be, for whom the chance is all fairness can give; and the rate between a unit and a period of waiting is the degree to which Fungibility fails, which the theory leaves to the case. Two things it does fix. The queue is forbidden wherever exit is unforeseeable: it gives whoever leaves early no chance at all, so that her claim is overridden rather than given the</w:t>
+      </w:r>
+      <w:r>
+        <w:t xml:space="preserve"> </w:t>
+      </w:r>
+      <w:r>
+        <w:t xml:space="preserve">“</w:t>
+      </w:r>
+      <w:r>
+        <w:t xml:space="preserve">some satisfaction</w:t>
+      </w:r>
+      <w:r>
+        <w:t xml:space="preserve">”</w:t>
+      </w:r>
+      <w:r>
+        <w:t xml:space="preserve"> </w:t>
+      </w:r>
+      <w:r>
+        <w:t xml:space="preserve">Broome requires of every claim (95, 98–99); it is</w:t>
+      </w:r>
+      <w:r>
+        <w:t xml:space="preserve"> </w:t>
+      </w:r>
+      <w:r>
+        <w:t xml:space="preserve">“</w:t>
+      </w:r>
+      <w:r>
+        <w:t xml:space="preserve">never on the cards</w:t>
+      </w:r>
+      <w:r>
+        <w:t xml:space="preserve">”</w:t>
+      </w:r>
+      <w:r>
+        <w:t xml:space="preserve"> </w:t>
+      </w:r>
+      <w:r>
+        <w:t xml:space="preserve">(98). The theory forbids the exact zero; how far above it fairness requires is the weighing that follows. And between forgetting and a weight the theory fixes the frontier, not the point; I judge forgetting the fairer, since what the unserved lose is the good and what the served gain is its timing, and say so; and where Fungibility fails hardest, as for the visa applicant, those who leave unserved are the very claimants for whom timing was the claim, so the chance now is what they are owed. So the result is two-sided a second way. Where everyone will be served, the waiting is divisible and fairness requires a queue; where some will leave unserved and the allocator cannot tell who, the queue is forbidden and memory is dearly bought. Memory is required in one structure and all but forbidden in the other; the difference is whether there are past winners whose surplus can pay for it. Housing lists and transplant lists, where some always leave unserved, fall on the second side so far as exit is unforeseeable. Where it is foreseeable, or rises with waiting, the claim is urgent, time waited is evidence of urgency, and the rule must weight it, as transplant allocation does: a difference in claims, not a memory of history.</w:t>
       </w:r>
     </w:p>
     <w:p>
@@ -4968,7 +5310,7 @@
         <w:pStyle w:val="BodyText"/>
       </w:pPr>
       <w:r>
-        <w:t xml:space="preserve">The verdict for the visa lotteries follows, and it is not what the opening suggests. They are bottlenecks with attrition: a selected worker leaves the pool, and an unselected one may lose her sponsor or status unforeseeably. So the lottery that forgets is the fair rule, and Hersch and Rowe’s</w:t>
+        <w:t xml:space="preserve">The verdict for the visa lotteries follows, and it is not what the opening suggests. They are bottlenecks with attrition: a selected worker leaves the pool, and an unselected one may lose her sponsor or status unforeseeably. So the lottery that forgets is, by that judgement, the fairer rule, and Hersch and Rowe’s</w:t>
       </w:r>
       <w:r>
         <w:t xml:space="preserve"> </w:t>
@@ -5012,9 +5354,9 @@
         <w:t xml:space="preserve">may wait far longer than a lucky newcomer (199) holds only where everyone will be served.</w:t>
       </w:r>
     </w:p>
+    <w:bookmarkEnd w:id="31"/>
     <w:bookmarkEnd w:id="32"/>
-    <w:bookmarkEnd w:id="33"/>
-    <w:bookmarkStart w:id="34" w:name="how-far-does-memory-reach"/>
+    <w:bookmarkStart w:id="33" w:name="how-far-does-memory-reach"/>
     <w:p>
       <w:pPr>
         <w:pStyle w:val="Heading1"/>
@@ -5028,7 +5370,7 @@
         <w:pStyle w:val="FirstParagraph"/>
       </w:pPr>
       <w:r>
-        <w:t xml:space="preserve">If Nevada must remember Maggie’s 2026 loss in 2027, must it remember her loss in the housing lottery? In Arizona’s draw? A view that cannot stop somewhere principled collapses into a demand that luck be equalized, a more contested thesis. Two bounds, besides the bounds of kind and weight in §5, follow from the argument that generates the claim.</w:t>
+        <w:t xml:space="preserve">If Nevada must remember Maggie’s 2026 loss in 2027, must it remember her loss in the housing lottery? In Arizona’s draw? A view that cannot stop somewhere principled collapses into a demand that luck be equalized, a more contested thesis. Two bounds, besides the bound in weight from §5, follow from the argument that generates the claim.</w:t>
       </w:r>
     </w:p>
     <w:p>
@@ -5078,7 +5420,7 @@
         <w:t xml:space="preserve"> </w:t>
       </w:r>
       <w:r>
-        <w:t xml:space="preserve">agency. The good matters because the 2027 tag can divide the sequence only because it is a tag; a flat is no portion of what the hunter has a claim to. Goods are individuated by claims, not names: a Nevada tag and an Arizona tag are different goods, since a claim to hunt in one state is not satisfied by a tag for the other, but two draws run by one agency for the same tag are one good, so an allocator cannot shed its obligation by splitting a practice. The agency matters because another allocator has none of its units to divide. This distinguishes the thesis from luck egalitarianism</w:t>
+        <w:t xml:space="preserve">agency. The good matters because the 2027 tag can divide the sequence only because it is a tag; a flat is no portion of what the hunter has a claim to. Goods are individuated by claims: a Nevada tag and an Arizona tag are different goods, two draws by one agency for the same tag one good, so an allocator cannot shed its obligation by splitting a practice. The agency matters because another allocator has none of its units to divide. This distinguishes the thesis from luck egalitarianism</w:t>
       </w:r>
       <w:r>
         <w:t xml:space="preserve"> </w:t>
@@ -5126,7 +5468,7 @@
         <w:t xml:space="preserve">)</w:t>
       </w:r>
       <w:r>
-        <w:t xml:space="preserve">, whose currency is compensation, so that a shortfall in one good can be made up in another; mine is silent on whether the loser is worse off overall.</w:t>
+        <w:t xml:space="preserve">, whose currency is compensation, so that a shortfall in one good can be made up in another; mine is silent on whether the loser is worse off.</w:t>
       </w:r>
     </w:p>
     <w:p>
@@ -5144,24 +5486,11 @@
         <w:t xml:space="preserve"> </w:t>
       </w:r>
       <w:r>
-        <w:t xml:space="preserve">The corrective claim is a strengthened claim to the good, not a credit. Someone who applied unsuccessfully for ten years and then gave up hunting is owed nothing; there is no tag she has a claim to. Memory is not compensation: shortfall arises under the fairest rule, since the residual lottery produces it, so correcting it presupposes no wrong. A boundary question follows.</w:t>
-      </w:r>
-      <w:r>
-        <w:t xml:space="preserve"> </w:t>
-      </w:r>
-      <w:r>
-        <w:rPr>
-          <w:iCs/>
-          <w:i/>
-        </w:rPr>
-        <w:t xml:space="preserve">Transition</w:t>
-      </w:r>
-      <w:r>
-        <w:t xml:space="preserve">: when a forgetting practice adopts memory, the whole record counts, wins and losses, since the shortfall existed whether or not the rule tracked it; a rectificatory view would count only the losses.</w:t>
-      </w:r>
-    </w:p>
-    <w:bookmarkEnd w:id="34"/>
-    <w:bookmarkStart w:id="35" w:name="objections"/>
+        <w:t xml:space="preserve">The corrective claim is a strengthened claim to the good, not a credit. Someone who applied unsuccessfully for ten years and then gave up hunting is owed nothing; there is no tag she has a claim to. Memory is not compensation: shortfall arises under the fairest rule, since the residual lottery produces it, so correcting it presupposes no wrong.</w:t>
+      </w:r>
+    </w:p>
+    <w:bookmarkEnd w:id="33"/>
+    <w:bookmarkStart w:id="34" w:name="objections"/>
     <w:p>
       <w:pPr>
         <w:pStyle w:val="Heading1"/>
@@ -5208,7 +5537,7 @@
         <w:t xml:space="preserve">n. 46)</w:t>
       </w:r>
       <w:r>
-        <w:t xml:space="preserve">. In my cases losing is not under the claimant’s control: she can only apply, and applying without a genuine claim is the problem of verifying claims, which every allocation faces. Where losing is controllable, as in a league, fairness is in tension with incentive, a reason to weigh fairness against other things, not evidence that fairness requires forgetting. Memory does raise the value of a manufactured claim, a ticket that grows; the response is to attach it to participation that costs something, as a paid licence does: a constraint on implementing fairness, not evidence that fairness has no memory.</w:t>
+        <w:t xml:space="preserve">. In my cases losing is not under the claimant’s control: she can only apply, and applying without a genuine claim is the problem of verifying claims, which every allocation faces. Where losing is controllable, as in a league, fairness is in tension with incentive, which is a reason to weigh it against other things, not evidence that it requires forgetting.</w:t>
       </w:r>
     </w:p>
     <w:p>
@@ -5246,7 +5575,7 @@
         <w:t xml:space="preserve">)</w:t>
       </w:r>
       <w:r>
-        <w:t xml:space="preserve">. Suppose the persistent loser is, all things considered, no worse off than the repeat winner. Her complaint survives: this agency, dividing this good among equal claims, has given her less than her share. That is comparative, concerns the good in question, and is addressed to the allocator, the marks of a fairness complaint in Broome’s sense; a priority view cannot explain why it lapses when she stops claiming.</w:t>
+        <w:t xml:space="preserve">. Suppose the persistent loser is, all things considered, no worse off than the repeat winner. Her complaint survives: this agency, dividing this good among equal claims, has given her less than her share. A priority view cannot explain why that complaint lapses when she stops claiming.</w:t>
       </w:r>
     </w:p>
     <w:p>
@@ -5341,8 +5670,8 @@
         <w:t xml:space="preserve">, that a procedure’s fairness is a matter of the prospects it gives people at the time of choice. On that view the forgetting rule and rotation are equally fair, since each claimant starts with the same prospects under both; the forgetting rule’s defect, as the first row of Table 1 showed, is entirely ex post. First reply: the ex ante view must say when the ex ante is. At the beginning of the practice, forgetting and rotation are identical, and the Division Principle settles what the view leaves open; at the beginning of each period, the view asserts separability with respect to history-blind claims, which the cake refutes. Second, my view is ex ante exactly where the ex ante view is right: a claimant is owed chances insofar as division is unavailable to her and units insofar as it is, which is why the surrogate constraint conditions on her tenure, which settles whether division was available to her, and not on her draws, which are the surrogate itself. Dated at her entry, every rule gives her the same prospects, by conservation; the ex ante view, built for one-shot cases where division never is, can tell none of them apart.</w:t>
       </w:r>
     </w:p>
-    <w:bookmarkEnd w:id="35"/>
-    <w:bookmarkStart w:id="103" w:name="conclusion"/>
+    <w:bookmarkEnd w:id="34"/>
+    <w:bookmarkStart w:id="102" w:name="conclusion"/>
     <w:p>
       <w:pPr>
         <w:pStyle w:val="Heading1"/>
@@ -5356,11 +5685,11 @@
         <w:pStyle w:val="FirstParagraph"/>
       </w:pPr>
       <w:r>
-        <w:t xml:space="preserve">Fairness has memory where the good recurs. What the memory tracks is a claimant’s shortfall from her share of the good being divided; it is owed by the agency dividing the good, for as long as she has a claim to it; and it may be pressed only through a rule whose transfers between classes are a by-product of a winner’s not being taxable rather than its mechanism, and no harder than excludes a claimant when she holds a whole unit of another’s share. Where winners leave and some will leave unserved, nobody present holds a unit, so any weight on waiting is transfer and nothing else, and the same constraint forbids memory. The result was visible in Broome’s own illustration of the Division Principle: military service, divided by conscripting everyone for a short time. Everyone’s short time is a rotation. The lottery is what one does when one cannot rotate, and one can rotate more often than its defenders have noticed.</w:t>
-      </w:r>
-    </w:p>
-    <w:bookmarkStart w:id="102" w:name="refs"/>
-    <w:bookmarkStart w:id="36" w:name="ref-Aleksandrov2015"/>
+        <w:t xml:space="preserve">Fairness has memory where the good recurs. What the memory tracks is a claimant’s shortfall from her share of the good being divided; it is owed by the agency dividing the good, for as long as she has a claim to it; and it may be pressed only as far as the chance owed to those who may leave allows, which where the good recurs is far, since past winners pay. Where winners leave and some will leave unserved, nobody present holds a surplus, every weight on waiting is paid by those who will never be served, and I have argued that the weighing tells against memory. The result was visible in Broome’s own illustration of the Division Principle: military service, divided by conscripting everyone for a short time. Everyone’s short time is a rotation. The lottery is what one does when one cannot rotate, and one can rotate more often than its defenders have noticed.</w:t>
+      </w:r>
+    </w:p>
+    <w:bookmarkStart w:id="101" w:name="refs"/>
+    <w:bookmarkStart w:id="35" w:name="ref-Aleksandrov2015"/>
     <w:p>
       <w:pPr>
         <w:pStyle w:val="Bibliography"/>
@@ -5388,8 +5717,8 @@
         <w:t xml:space="preserve">, 2540–46.</w:t>
       </w:r>
     </w:p>
-    <w:bookmarkEnd w:id="36"/>
-    <w:bookmarkStart w:id="38" w:name="ref-AleksandrovWalsh2020"/>
+    <w:bookmarkEnd w:id="35"/>
+    <w:bookmarkStart w:id="37" w:name="ref-AleksandrovWalsh2020"/>
     <w:p>
       <w:pPr>
         <w:pStyle w:val="Bibliography"/>
@@ -5422,7 +5751,7 @@
       <w:r>
         <w:t xml:space="preserve"> </w:t>
       </w:r>
-      <w:hyperlink r:id="rId37">
+      <w:hyperlink r:id="rId36">
         <w:r>
           <w:rPr>
             <w:rStyle w:val="Hyperlink"/>
@@ -5434,8 +5763,8 @@
         <w:t xml:space="preserve">.</w:t>
       </w:r>
     </w:p>
-    <w:bookmarkEnd w:id="38"/>
-    <w:bookmarkStart w:id="39" w:name="ref-BalinskiYoung2001"/>
+    <w:bookmarkEnd w:id="37"/>
+    <w:bookmarkStart w:id="38" w:name="ref-BalinskiYoung2001"/>
     <w:p>
       <w:pPr>
         <w:pStyle w:val="Bibliography"/>
@@ -5457,8 +5786,8 @@
         <w:t xml:space="preserve">. 2nd ed. Brookings Institution Press.</w:t>
       </w:r>
     </w:p>
-    <w:bookmarkEnd w:id="39"/>
-    <w:bookmarkStart w:id="41" w:name="ref-Benade2018"/>
+    <w:bookmarkEnd w:id="38"/>
+    <w:bookmarkStart w:id="40" w:name="ref-Benade2018"/>
     <w:p>
       <w:pPr>
         <w:pStyle w:val="Bibliography"/>
@@ -5488,7 +5817,7 @@
       <w:r>
         <w:t xml:space="preserve"> </w:t>
       </w:r>
-      <w:hyperlink r:id="rId40">
+      <w:hyperlink r:id="rId39">
         <w:r>
           <w:rPr>
             <w:rStyle w:val="Hyperlink"/>
@@ -5500,8 +5829,8 @@
         <w:t xml:space="preserve">.</w:t>
       </w:r>
     </w:p>
-    <w:bookmarkEnd w:id="41"/>
-    <w:bookmarkStart w:id="43" w:name="ref-Broome1984"/>
+    <w:bookmarkEnd w:id="40"/>
+    <w:bookmarkStart w:id="42" w:name="ref-Broome1984"/>
     <w:p>
       <w:pPr>
         <w:pStyle w:val="Bibliography"/>
@@ -5534,7 +5863,7 @@
       <w:r>
         <w:t xml:space="preserve"> </w:t>
       </w:r>
-      <w:hyperlink r:id="rId42">
+      <w:hyperlink r:id="rId41">
         <w:r>
           <w:rPr>
             <w:rStyle w:val="Hyperlink"/>
@@ -5546,8 +5875,8 @@
         <w:t xml:space="preserve">.</w:t>
       </w:r>
     </w:p>
-    <w:bookmarkEnd w:id="43"/>
-    <w:bookmarkStart w:id="45" w:name="ref-Broome1984b"/>
+    <w:bookmarkEnd w:id="42"/>
+    <w:bookmarkStart w:id="44" w:name="ref-Broome1984b"/>
     <w:p>
       <w:pPr>
         <w:pStyle w:val="Bibliography"/>
@@ -5580,7 +5909,7 @@
       <w:r>
         <w:t xml:space="preserve"> </w:t>
       </w:r>
-      <w:hyperlink r:id="rId44">
+      <w:hyperlink r:id="rId43">
         <w:r>
           <w:rPr>
             <w:rStyle w:val="Hyperlink"/>
@@ -5592,8 +5921,8 @@
         <w:t xml:space="preserve">.</w:t>
       </w:r>
     </w:p>
-    <w:bookmarkEnd w:id="45"/>
-    <w:bookmarkStart w:id="47" w:name="ref-Broome1991a"/>
+    <w:bookmarkEnd w:id="44"/>
+    <w:bookmarkStart w:id="46" w:name="ref-Broome1991a"/>
     <w:p>
       <w:pPr>
         <w:pStyle w:val="Bibliography"/>
@@ -5626,7 +5955,7 @@
       <w:r>
         <w:t xml:space="preserve"> </w:t>
       </w:r>
-      <w:hyperlink r:id="rId46">
+      <w:hyperlink r:id="rId45">
         <w:r>
           <w:rPr>
             <w:rStyle w:val="Hyperlink"/>
@@ -5638,8 +5967,8 @@
         <w:t xml:space="preserve">.</w:t>
       </w:r>
     </w:p>
-    <w:bookmarkEnd w:id="47"/>
-    <w:bookmarkStart w:id="48" w:name="ref-Broome1991b"/>
+    <w:bookmarkEnd w:id="46"/>
+    <w:bookmarkStart w:id="47" w:name="ref-Broome1991b"/>
     <w:p>
       <w:pPr>
         <w:pStyle w:val="Bibliography"/>
@@ -5661,8 +5990,8 @@
         <w:t xml:space="preserve">. Blackwell.</w:t>
       </w:r>
     </w:p>
-    <w:bookmarkEnd w:id="48"/>
-    <w:bookmarkStart w:id="50" w:name="ref-Cohen1989"/>
+    <w:bookmarkEnd w:id="47"/>
+    <w:bookmarkStart w:id="49" w:name="ref-Cohen1989"/>
     <w:p>
       <w:pPr>
         <w:pStyle w:val="Bibliography"/>
@@ -5695,7 +6024,7 @@
       <w:r>
         <w:t xml:space="preserve"> </w:t>
       </w:r>
-      <w:hyperlink r:id="rId49">
+      <w:hyperlink r:id="rId48">
         <w:r>
           <w:rPr>
             <w:rStyle w:val="Hyperlink"/>
@@ -5707,8 +6036,8 @@
         <w:t xml:space="preserve">.</w:t>
       </w:r>
     </w:p>
-    <w:bookmarkEnd w:id="50"/>
-    <w:bookmarkStart w:id="52" w:name="ref-Diamond1967"/>
+    <w:bookmarkEnd w:id="49"/>
+    <w:bookmarkStart w:id="51" w:name="ref-Diamond1967"/>
     <w:p>
       <w:pPr>
         <w:pStyle w:val="Bibliography"/>
@@ -5741,7 +6070,7 @@
       <w:r>
         <w:t xml:space="preserve"> </w:t>
       </w:r>
-      <w:hyperlink r:id="rId51">
+      <w:hyperlink r:id="rId50">
         <w:r>
           <w:rPr>
             <w:rStyle w:val="Hyperlink"/>
@@ -5753,8 +6082,8 @@
         <w:t xml:space="preserve">.</w:t>
       </w:r>
     </w:p>
-    <w:bookmarkEnd w:id="52"/>
-    <w:bookmarkStart w:id="53" w:name="ref-Duxbury1999"/>
+    <w:bookmarkEnd w:id="51"/>
+    <w:bookmarkStart w:id="52" w:name="ref-Duxbury1999"/>
     <w:p>
       <w:pPr>
         <w:pStyle w:val="Bibliography"/>
@@ -5776,8 +6105,8 @@
         <w:t xml:space="preserve">. Oxford University Press.</w:t>
       </w:r>
     </w:p>
-    <w:bookmarkEnd w:id="53"/>
-    <w:bookmarkStart w:id="54" w:name="ref-Dworkin1981"/>
+    <w:bookmarkEnd w:id="52"/>
+    <w:bookmarkStart w:id="53" w:name="ref-Dworkin1981"/>
     <w:p>
       <w:pPr>
         <w:pStyle w:val="Bibliography"/>
@@ -5808,8 +6137,8 @@
         <w:t xml:space="preserve">10 (4): 283–345.</w:t>
       </w:r>
     </w:p>
-    <w:bookmarkEnd w:id="54"/>
-    <w:bookmarkStart w:id="56" w:name="ref-Elster1988"/>
+    <w:bookmarkEnd w:id="53"/>
+    <w:bookmarkStart w:id="55" w:name="ref-Elster1988"/>
     <w:p>
       <w:pPr>
         <w:pStyle w:val="Bibliography"/>
@@ -5845,7 +6174,7 @@
       <w:r>
         <w:t xml:space="preserve"> </w:t>
       </w:r>
-      <w:hyperlink r:id="rId55">
+      <w:hyperlink r:id="rId54">
         <w:r>
           <w:rPr>
             <w:rStyle w:val="Hyperlink"/>
@@ -5857,8 +6186,8 @@
         <w:t xml:space="preserve">.</w:t>
       </w:r>
     </w:p>
-    <w:bookmarkEnd w:id="56"/>
-    <w:bookmarkStart w:id="57" w:name="ref-Elster1989"/>
+    <w:bookmarkEnd w:id="55"/>
+    <w:bookmarkStart w:id="56" w:name="ref-Elster1989"/>
     <w:p>
       <w:pPr>
         <w:pStyle w:val="Bibliography"/>
@@ -5880,8 +6209,8 @@
         <w:t xml:space="preserve">. Cambridge University Press.</w:t>
       </w:r>
     </w:p>
-    <w:bookmarkEnd w:id="57"/>
-    <w:bookmarkStart w:id="59" w:name="ref-FeldblyumLeBlevennec2023"/>
+    <w:bookmarkEnd w:id="56"/>
+    <w:bookmarkStart w:id="58" w:name="ref-FeldblyumLeBlevennec2023"/>
     <w:p>
       <w:pPr>
         <w:pStyle w:val="Bibliography"/>
@@ -5914,7 +6243,7 @@
       <w:r>
         <w:t xml:space="preserve"> </w:t>
       </w:r>
-      <w:hyperlink r:id="rId58">
+      <w:hyperlink r:id="rId57">
         <w:r>
           <w:rPr>
             <w:rStyle w:val="Hyperlink"/>
@@ -5926,8 +6255,8 @@
         <w:t xml:space="preserve">.</w:t>
       </w:r>
     </w:p>
-    <w:bookmarkEnd w:id="59"/>
-    <w:bookmarkStart w:id="61" w:name="ref-FreemanZahediConitzer2017"/>
+    <w:bookmarkEnd w:id="58"/>
+    <w:bookmarkStart w:id="60" w:name="ref-FreemanZahediConitzer2017"/>
     <w:p>
       <w:pPr>
         <w:pStyle w:val="Bibliography"/>
@@ -5957,7 +6286,7 @@
       <w:r>
         <w:t xml:space="preserve"> </w:t>
       </w:r>
-      <w:hyperlink r:id="rId60">
+      <w:hyperlink r:id="rId59">
         <w:r>
           <w:rPr>
             <w:rStyle w:val="Hyperlink"/>
@@ -5969,8 +6298,8 @@
         <w:t xml:space="preserve">.</w:t>
       </w:r>
     </w:p>
-    <w:bookmarkEnd w:id="61"/>
-    <w:bookmarkStart w:id="63" w:name="ref-Frick2015"/>
+    <w:bookmarkEnd w:id="60"/>
+    <w:bookmarkStart w:id="62" w:name="ref-Frick2015"/>
     <w:p>
       <w:pPr>
         <w:pStyle w:val="Bibliography"/>
@@ -6003,7 +6332,7 @@
       <w:r>
         <w:t xml:space="preserve"> </w:t>
       </w:r>
-      <w:hyperlink r:id="rId62">
+      <w:hyperlink r:id="rId61">
         <w:r>
           <w:rPr>
             <w:rStyle w:val="Hyperlink"/>
@@ -6015,8 +6344,8 @@
         <w:t xml:space="preserve">.</w:t>
       </w:r>
     </w:p>
-    <w:bookmarkEnd w:id="63"/>
-    <w:bookmarkStart w:id="65" w:name="ref-Harsanyi1955"/>
+    <w:bookmarkEnd w:id="62"/>
+    <w:bookmarkStart w:id="64" w:name="ref-Harsanyi1955"/>
     <w:p>
       <w:pPr>
         <w:pStyle w:val="Bibliography"/>
@@ -6049,7 +6378,7 @@
       <w:r>
         <w:t xml:space="preserve"> </w:t>
       </w:r>
-      <w:hyperlink r:id="rId64">
+      <w:hyperlink r:id="rId63">
         <w:r>
           <w:rPr>
             <w:rStyle w:val="Hyperlink"/>
@@ -6061,8 +6390,8 @@
         <w:t xml:space="preserve">.</w:t>
       </w:r>
     </w:p>
-    <w:bookmarkEnd w:id="65"/>
-    <w:bookmarkStart w:id="67" w:name="ref-HerschRowe2024"/>
+    <w:bookmarkEnd w:id="64"/>
+    <w:bookmarkStart w:id="66" w:name="ref-HerschRowe2024"/>
     <w:p>
       <w:pPr>
         <w:pStyle w:val="Bibliography"/>
@@ -6098,7 +6427,7 @@
       <w:r>
         <w:t xml:space="preserve"> </w:t>
       </w:r>
-      <w:hyperlink r:id="rId66">
+      <w:hyperlink r:id="rId65">
         <w:r>
           <w:rPr>
             <w:rStyle w:val="Hyperlink"/>
@@ -6110,8 +6439,8 @@
         <w:t xml:space="preserve">.</w:t>
       </w:r>
     </w:p>
-    <w:bookmarkEnd w:id="67"/>
-    <w:bookmarkStart w:id="69" w:name="ref-HerschRowe2025"/>
+    <w:bookmarkEnd w:id="66"/>
+    <w:bookmarkStart w:id="68" w:name="ref-HerschRowe2025"/>
     <w:p>
       <w:pPr>
         <w:pStyle w:val="Bibliography"/>
@@ -6144,7 +6473,7 @@
       <w:r>
         <w:t xml:space="preserve"> </w:t>
       </w:r>
-      <w:hyperlink r:id="rId68">
+      <w:hyperlink r:id="rId67">
         <w:r>
           <w:rPr>
             <w:rStyle w:val="Hyperlink"/>
@@ -6156,8 +6485,8 @@
         <w:t xml:space="preserve">.</w:t>
       </w:r>
     </w:p>
-    <w:bookmarkEnd w:id="69"/>
-    <w:bookmarkStart w:id="71" w:name="ref-Igarashi2024"/>
+    <w:bookmarkEnd w:id="68"/>
+    <w:bookmarkStart w:id="70" w:name="ref-Igarashi2024"/>
     <w:p>
       <w:pPr>
         <w:pStyle w:val="Bibliography"/>
@@ -6190,7 +6519,7 @@
       <w:r>
         <w:t xml:space="preserve"> </w:t>
       </w:r>
-      <w:hyperlink r:id="rId70">
+      <w:hyperlink r:id="rId69">
         <w:r>
           <w:rPr>
             <w:rStyle w:val="Hyperlink"/>
@@ -6202,8 +6531,8 @@
         <w:t xml:space="preserve">.</w:t>
       </w:r>
     </w:p>
-    <w:bookmarkEnd w:id="71"/>
-    <w:bookmarkStart w:id="73" w:name="ref-JohnMillum2020"/>
+    <w:bookmarkEnd w:id="70"/>
+    <w:bookmarkStart w:id="72" w:name="ref-JohnMillum2020"/>
     <w:p>
       <w:pPr>
         <w:pStyle w:val="Bibliography"/>
@@ -6236,7 +6565,7 @@
       <w:r>
         <w:t xml:space="preserve"> </w:t>
       </w:r>
-      <w:hyperlink r:id="rId72">
+      <w:hyperlink r:id="rId71">
         <w:r>
           <w:rPr>
             <w:rStyle w:val="Hyperlink"/>
@@ -6248,8 +6577,8 @@
         <w:t xml:space="preserve">.</w:t>
       </w:r>
     </w:p>
-    <w:bookmarkEnd w:id="73"/>
-    <w:bookmarkStart w:id="75" w:name="ref-KornhauserSager1988"/>
+    <w:bookmarkEnd w:id="72"/>
+    <w:bookmarkStart w:id="74" w:name="ref-KornhauserSager1988"/>
     <w:p>
       <w:pPr>
         <w:pStyle w:val="Bibliography"/>
@@ -6282,7 +6611,7 @@
       <w:r>
         <w:t xml:space="preserve"> </w:t>
       </w:r>
-      <w:hyperlink r:id="rId74">
+      <w:hyperlink r:id="rId73">
         <w:r>
           <w:rPr>
             <w:rStyle w:val="Hyperlink"/>
@@ -6294,8 +6623,8 @@
         <w:t xml:space="preserve">.</w:t>
       </w:r>
     </w:p>
-    <w:bookmarkEnd w:id="75"/>
-    <w:bookmarkStart w:id="77" w:name="ref-Lackner2020"/>
+    <w:bookmarkEnd w:id="74"/>
+    <w:bookmarkStart w:id="76" w:name="ref-Lackner2020"/>
     <w:p>
       <w:pPr>
         <w:pStyle w:val="Bibliography"/>
@@ -6328,7 +6657,7 @@
       <w:r>
         <w:t xml:space="preserve"> </w:t>
       </w:r>
-      <w:hyperlink r:id="rId76">
+      <w:hyperlink r:id="rId75">
         <w:r>
           <w:rPr>
             <w:rStyle w:val="Hyperlink"/>
@@ -6340,8 +6669,8 @@
         <w:t xml:space="preserve">.</w:t>
       </w:r>
     </w:p>
-    <w:bookmarkEnd w:id="77"/>
-    <w:bookmarkStart w:id="79" w:name="ref-LacknerMaly2023"/>
+    <w:bookmarkEnd w:id="76"/>
+    <w:bookmarkStart w:id="78" w:name="ref-LacknerMaly2023"/>
     <w:p>
       <w:pPr>
         <w:pStyle w:val="Bibliography"/>
@@ -6374,7 +6703,7 @@
       <w:r>
         <w:t xml:space="preserve"> </w:t>
       </w:r>
-      <w:hyperlink r:id="rId78">
+      <w:hyperlink r:id="rId77">
         <w:r>
           <w:rPr>
             <w:rStyle w:val="Hyperlink"/>
@@ -6386,8 +6715,8 @@
         <w:t xml:space="preserve">.</w:t>
       </w:r>
     </w:p>
-    <w:bookmarkEnd w:id="79"/>
-    <w:bookmarkStart w:id="81" w:name="ref-OtsukaVoorhoeve2009"/>
+    <w:bookmarkEnd w:id="78"/>
+    <w:bookmarkStart w:id="80" w:name="ref-OtsukaVoorhoeve2009"/>
     <w:p>
       <w:pPr>
         <w:pStyle w:val="Bibliography"/>
@@ -6420,7 +6749,7 @@
       <w:r>
         <w:t xml:space="preserve"> </w:t>
       </w:r>
-      <w:hyperlink r:id="rId80">
+      <w:hyperlink r:id="rId79">
         <w:r>
           <w:rPr>
             <w:rStyle w:val="Hyperlink"/>
@@ -6432,8 +6761,8 @@
         <w:t xml:space="preserve">.</w:t>
       </w:r>
     </w:p>
-    <w:bookmarkEnd w:id="81"/>
-    <w:bookmarkStart w:id="82" w:name="ref-Parfit2000"/>
+    <w:bookmarkEnd w:id="80"/>
+    <w:bookmarkStart w:id="81" w:name="ref-Parfit2000"/>
     <w:p>
       <w:pPr>
         <w:pStyle w:val="Bibliography"/>
@@ -6464,8 +6793,8 @@
         <w:t xml:space="preserve">, edited by Matthew Clayton and Andrew Williams. Macmillan.</w:t>
       </w:r>
     </w:p>
-    <w:bookmarkEnd w:id="82"/>
-    <w:bookmarkStart w:id="84" w:name="ref-Saunders2008"/>
+    <w:bookmarkEnd w:id="81"/>
+    <w:bookmarkStart w:id="83" w:name="ref-Saunders2008"/>
     <w:p>
       <w:pPr>
         <w:pStyle w:val="Bibliography"/>
@@ -6498,7 +6827,7 @@
       <w:r>
         <w:t xml:space="preserve"> </w:t>
       </w:r>
-      <w:hyperlink r:id="rId83">
+      <w:hyperlink r:id="rId82">
         <w:r>
           <w:rPr>
             <w:rStyle w:val="Hyperlink"/>
@@ -6510,8 +6839,8 @@
         <w:t xml:space="preserve">.</w:t>
       </w:r>
     </w:p>
-    <w:bookmarkEnd w:id="84"/>
-    <w:bookmarkStart w:id="86" w:name="ref-Sher1980"/>
+    <w:bookmarkEnd w:id="83"/>
+    <w:bookmarkStart w:id="85" w:name="ref-Sher1980"/>
     <w:p>
       <w:pPr>
         <w:pStyle w:val="Bibliography"/>
@@ -6558,7 +6887,7 @@
       <w:r>
         <w:t xml:space="preserve"> </w:t>
       </w:r>
-      <w:hyperlink r:id="rId85">
+      <w:hyperlink r:id="rId84">
         <w:r>
           <w:rPr>
             <w:rStyle w:val="Hyperlink"/>
@@ -6570,8 +6899,8 @@
         <w:t xml:space="preserve">.</w:t>
       </w:r>
     </w:p>
-    <w:bookmarkEnd w:id="86"/>
-    <w:bookmarkStart w:id="88" w:name="ref-Spiekermann2022"/>
+    <w:bookmarkEnd w:id="85"/>
+    <w:bookmarkStart w:id="87" w:name="ref-Spiekermann2022"/>
     <w:p>
       <w:pPr>
         <w:pStyle w:val="Bibliography"/>
@@ -6604,7 +6933,7 @@
       <w:r>
         <w:t xml:space="preserve"> </w:t>
       </w:r>
-      <w:hyperlink r:id="rId87">
+      <w:hyperlink r:id="rId86">
         <w:r>
           <w:rPr>
             <w:rStyle w:val="Hyperlink"/>
@@ -6616,8 +6945,8 @@
         <w:t xml:space="preserve">.</w:t>
       </w:r>
     </w:p>
-    <w:bookmarkEnd w:id="88"/>
-    <w:bookmarkStart w:id="90" w:name="ref-Stone2007"/>
+    <w:bookmarkEnd w:id="87"/>
+    <w:bookmarkStart w:id="89" w:name="ref-Stone2007"/>
     <w:p>
       <w:pPr>
         <w:pStyle w:val="Bibliography"/>
@@ -6650,7 +6979,7 @@
       <w:r>
         <w:t xml:space="preserve"> </w:t>
       </w:r>
-      <w:hyperlink r:id="rId89">
+      <w:hyperlink r:id="rId88">
         <w:r>
           <w:rPr>
             <w:rStyle w:val="Hyperlink"/>
@@ -6662,8 +6991,8 @@
         <w:t xml:space="preserve">.</w:t>
       </w:r>
     </w:p>
-    <w:bookmarkEnd w:id="90"/>
-    <w:bookmarkStart w:id="92" w:name="ref-Stone2008"/>
+    <w:bookmarkEnd w:id="89"/>
+    <w:bookmarkStart w:id="91" w:name="ref-Stone2008"/>
     <w:p>
       <w:pPr>
         <w:pStyle w:val="Bibliography"/>
@@ -6696,7 +7025,7 @@
       <w:r>
         <w:t xml:space="preserve"> </w:t>
       </w:r>
-      <w:hyperlink r:id="rId91">
+      <w:hyperlink r:id="rId90">
         <w:r>
           <w:rPr>
             <w:rStyle w:val="Hyperlink"/>
@@ -6708,8 +7037,8 @@
         <w:t xml:space="preserve">.</w:t>
       </w:r>
     </w:p>
-    <w:bookmarkEnd w:id="92"/>
-    <w:bookmarkStart w:id="94" w:name="ref-Stone2011"/>
+    <w:bookmarkEnd w:id="91"/>
+    <w:bookmarkStart w:id="93" w:name="ref-Stone2011"/>
     <w:p>
       <w:pPr>
         <w:pStyle w:val="Bibliography"/>
@@ -6733,7 +7062,7 @@
       <w:r>
         <w:t xml:space="preserve"> </w:t>
       </w:r>
-      <w:hyperlink r:id="rId93">
+      <w:hyperlink r:id="rId92">
         <w:r>
           <w:rPr>
             <w:rStyle w:val="Hyperlink"/>
@@ -6745,8 +7074,8 @@
         <w:t xml:space="preserve">.</w:t>
       </w:r>
     </w:p>
-    <w:bookmarkEnd w:id="94"/>
-    <w:bookmarkStart w:id="95" w:name="ref-Temkin1993"/>
+    <w:bookmarkEnd w:id="93"/>
+    <w:bookmarkStart w:id="94" w:name="ref-Temkin1993"/>
     <w:p>
       <w:pPr>
         <w:pStyle w:val="Bibliography"/>
@@ -6768,8 +7097,8 @@
         <w:t xml:space="preserve">. Oxford University Press.</w:t>
       </w:r>
     </w:p>
-    <w:bookmarkEnd w:id="95"/>
-    <w:bookmarkStart w:id="97" w:name="ref-Vong2015"/>
+    <w:bookmarkEnd w:id="94"/>
+    <w:bookmarkStart w:id="96" w:name="ref-Vong2015"/>
     <w:p>
       <w:pPr>
         <w:pStyle w:val="Bibliography"/>
@@ -6802,7 +7131,7 @@
       <w:r>
         <w:t xml:space="preserve"> </w:t>
       </w:r>
-      <w:hyperlink r:id="rId96">
+      <w:hyperlink r:id="rId95">
         <w:r>
           <w:rPr>
             <w:rStyle w:val="Hyperlink"/>
@@ -6814,8 +7143,8 @@
         <w:t xml:space="preserve">.</w:t>
       </w:r>
     </w:p>
-    <w:bookmarkEnd w:id="97"/>
-    <w:bookmarkStart w:id="99" w:name="ref-Wasserman1996"/>
+    <w:bookmarkEnd w:id="96"/>
+    <w:bookmarkStart w:id="98" w:name="ref-Wasserman1996"/>
     <w:p>
       <w:pPr>
         <w:pStyle w:val="Bibliography"/>
@@ -6848,7 +7177,7 @@
       <w:r>
         <w:t xml:space="preserve"> </w:t>
       </w:r>
-      <w:hyperlink r:id="rId98">
+      <w:hyperlink r:id="rId97">
         <w:r>
           <w:rPr>
             <w:rStyle w:val="Hyperlink"/>
@@ -6860,8 +7189,8 @@
         <w:t xml:space="preserve">.</w:t>
       </w:r>
     </w:p>
-    <w:bookmarkEnd w:id="99"/>
-    <w:bookmarkStart w:id="101" w:name="ref-WinteinHeilmann2018"/>
+    <w:bookmarkEnd w:id="98"/>
+    <w:bookmarkStart w:id="100" w:name="ref-WinteinHeilmann2018"/>
     <w:p>
       <w:pPr>
         <w:pStyle w:val="Bibliography"/>
@@ -6894,7 +7223,7 @@
       <w:r>
         <w:t xml:space="preserve"> </w:t>
       </w:r>
-      <w:hyperlink r:id="rId100">
+      <w:hyperlink r:id="rId99">
         <w:r>
           <w:rPr>
             <w:rStyle w:val="Hyperlink"/>
@@ -6906,9 +7235,9 @@
         <w:t xml:space="preserve">.</w:t>
       </w:r>
     </w:p>
+    <w:bookmarkEnd w:id="100"/>
     <w:bookmarkEnd w:id="101"/>
     <w:bookmarkEnd w:id="102"/>
-    <w:bookmarkEnd w:id="103"/>
     <w:sectPr/>
   </w:body>
 </w:document>
@@ -7226,25 +7555,6 @@
       </w:r>
       <w:r>
         <w:t xml:space="preserve">concerns envy, not claims.</w:t>
-      </w:r>
-    </w:p>
-  </w:footnote>
-  <w:footnote w:id="31">
-    <w:p>
-      <w:pPr>
-        <w:pStyle w:val="FootnoteText"/>
-      </w:pPr>
-      <w:r>
-        <w:rPr>
-          <w:rStyle w:val="FootnoteReference"/>
-        </w:rPr>
-        <w:footnoteRef/>
-      </w:r>
-      <w:r>
-        <w:t xml:space="preserve"> </w:t>
-      </w:r>
-      <w:r>
-        <w:t xml:space="preserve">19.31.17.9 NMAC (2025).</w:t>
       </w:r>
     </w:p>
   </w:footnote>

</xml_diff>